<commit_message>
Atualização da aula dia 02/10/2026
</commit_message>
<xml_diff>
--- a/apostila/Apostila Space For Men.docx
+++ b/apostila/Apostila Space For Men.docx
@@ -427,11 +427,10 @@
           <w:sz w:val="24"/>
           <w:szCs w:val="24"/>
         </w:rPr>
-        <w:lastRenderedPageBreak/>
         <w:drawing>
           <wp:inline distT="0" distB="0" distL="0" distR="0" wp14:anchorId="3850EC13" wp14:editId="3B922ED4">
-            <wp:extent cx="6436429" cy="2376449"/>
-            <wp:effectExtent l="0" t="0" r="2540" b="5080"/>
+            <wp:extent cx="4928187" cy="1819578"/>
+            <wp:effectExtent l="0" t="0" r="6350" b="9525"/>
             <wp:docPr id="3" name="Imagem 3"/>
             <wp:cNvGraphicFramePr>
               <a:graphicFrameLocks xmlns:a="http://schemas.openxmlformats.org/drawingml/2006/main" noChangeAspect="1"/>
@@ -452,7 +451,7 @@
                   <pic:spPr>
                     <a:xfrm>
                       <a:off x="0" y="0"/>
-                      <a:ext cx="6508939" cy="2403221"/>
+                      <a:ext cx="5004924" cy="1847911"/>
                     </a:xfrm>
                     <a:prstGeom prst="rect">
                       <a:avLst/>
@@ -493,6 +492,7 @@
           <w:sz w:val="24"/>
           <w:szCs w:val="24"/>
         </w:rPr>
+        <w:lastRenderedPageBreak/>
         <w:t xml:space="preserve">2 </w:t>
       </w:r>
       <w:r>
@@ -821,7 +821,6 @@
           <w:sz w:val="24"/>
           <w:szCs w:val="24"/>
         </w:rPr>
-        <w:lastRenderedPageBreak/>
         <w:t>4- Adicionamos a imagem banner ao nosso site utilizando o seguinte comando:</w:t>
       </w:r>
       <w:r>
@@ -1007,6 +1006,7 @@
           <w:sz w:val="24"/>
           <w:szCs w:val="24"/>
         </w:rPr>
+        <w:lastRenderedPageBreak/>
         <w:drawing>
           <wp:inline distT="0" distB="0" distL="0" distR="0" wp14:anchorId="6245F465" wp14:editId="0F4F8FEA">
             <wp:extent cx="2648320" cy="1114581"/>
@@ -1384,7 +1384,6 @@
           <w:sz w:val="24"/>
           <w:szCs w:val="24"/>
         </w:rPr>
-        <w:lastRenderedPageBreak/>
         <w:drawing>
           <wp:inline distT="0" distB="0" distL="0" distR="0" wp14:anchorId="1CBBF734" wp14:editId="34135E47">
             <wp:extent cx="5315692" cy="3057952"/>
@@ -1450,6 +1449,7 @@
           <w:sz w:val="24"/>
           <w:szCs w:val="24"/>
         </w:rPr>
+        <w:lastRenderedPageBreak/>
         <w:t xml:space="preserve">9 </w:t>
       </w:r>
       <w:r>
@@ -1783,7 +1783,6 @@
           <w:sz w:val="24"/>
           <w:szCs w:val="24"/>
         </w:rPr>
-        <w:lastRenderedPageBreak/>
         <w:drawing>
           <wp:inline distT="0" distB="0" distL="0" distR="0" wp14:anchorId="2D9DBB84" wp14:editId="14152CFA">
             <wp:extent cx="8573696" cy="4096322"/>
@@ -1849,6 +1848,7 @@
           <w:sz w:val="24"/>
           <w:szCs w:val="24"/>
         </w:rPr>
+        <w:lastRenderedPageBreak/>
         <w:t xml:space="preserve">11-    </w:t>
       </w:r>
       <w:r>
@@ -2176,6 +2176,7 @@
           <w:sz w:val="24"/>
           <w:szCs w:val="24"/>
         </w:rPr>
+        <w:lastRenderedPageBreak/>
         <w:drawing>
           <wp:inline distT="0" distB="0" distL="0" distR="0" wp14:anchorId="43883715" wp14:editId="2A98B38E">
             <wp:extent cx="5066876" cy="2155825"/>
@@ -2296,7 +2297,6 @@
           <w:sz w:val="24"/>
           <w:szCs w:val="24"/>
         </w:rPr>
-        <w:lastRenderedPageBreak/>
         <w:drawing>
           <wp:inline distT="0" distB="0" distL="0" distR="0" wp14:anchorId="0E249081" wp14:editId="01CC254E">
             <wp:extent cx="6344535" cy="5534797"/>
@@ -2362,6 +2362,7 @@
           <w:sz w:val="24"/>
           <w:szCs w:val="24"/>
         </w:rPr>
+        <w:lastRenderedPageBreak/>
         <w:t xml:space="preserve">14 – Na </w:t>
       </w:r>
       <w:proofErr w:type="spellStart"/>
@@ -2513,7 +2514,6 @@
           <w:sz w:val="24"/>
           <w:szCs w:val="24"/>
         </w:rPr>
-        <w:lastRenderedPageBreak/>
         <w:drawing>
           <wp:inline distT="0" distB="0" distL="0" distR="0" wp14:anchorId="165A4C43" wp14:editId="3DCEF4FA">
             <wp:extent cx="2915057" cy="1228896"/>
@@ -2738,6 +2738,7 @@
           <w:sz w:val="24"/>
           <w:szCs w:val="24"/>
         </w:rPr>
+        <w:lastRenderedPageBreak/>
         <w:drawing>
           <wp:inline distT="0" distB="0" distL="0" distR="0" wp14:anchorId="449C3AD7" wp14:editId="02F88A99">
             <wp:extent cx="2467319" cy="3343742"/>
@@ -2896,7 +2897,6 @@
           <w:sz w:val="24"/>
           <w:szCs w:val="24"/>
         </w:rPr>
-        <w:lastRenderedPageBreak/>
         <w:drawing>
           <wp:inline distT="0" distB="0" distL="0" distR="0" wp14:anchorId="498233E3" wp14:editId="136F54AF">
             <wp:extent cx="6792273" cy="2353003"/>
@@ -2994,6 +2994,7 @@
           <w:sz w:val="24"/>
           <w:szCs w:val="24"/>
         </w:rPr>
+        <w:lastRenderedPageBreak/>
         <w:drawing>
           <wp:inline distT="0" distB="0" distL="0" distR="0" wp14:anchorId="50176E91" wp14:editId="584F669E">
             <wp:extent cx="4963218" cy="2038635"/>
@@ -3282,7 +3283,6 @@
           <w:sz w:val="24"/>
           <w:szCs w:val="24"/>
         </w:rPr>
-        <w:lastRenderedPageBreak/>
         <mc:AlternateContent>
           <mc:Choice Requires="wps">
             <w:drawing>
@@ -3564,6 +3564,7 @@
           <w:sz w:val="24"/>
           <w:szCs w:val="24"/>
         </w:rPr>
+        <w:lastRenderedPageBreak/>
         <w:drawing>
           <wp:inline distT="0" distB="0" distL="0" distR="0" wp14:anchorId="6CA1DEE4" wp14:editId="65572247">
             <wp:extent cx="3905795" cy="2591162"/>
@@ -13580,6 +13581,7 @@
       </w:pPr>
       <w:r>
         <w:rPr>
+          <w:noProof/>
           <w:sz w:val="24"/>
           <w:szCs w:val="24"/>
         </w:rPr>
@@ -13673,6 +13675,7 @@
       </w:pPr>
       <w:r>
         <w:rPr>
+          <w:noProof/>
           <w:sz w:val="24"/>
           <w:szCs w:val="24"/>
         </w:rPr>
@@ -13947,6 +13950,7 @@
       </w:pPr>
       <w:r>
         <w:rPr>
+          <w:noProof/>
           <w:sz w:val="24"/>
           <w:szCs w:val="24"/>
         </w:rPr>
@@ -14000,6 +14004,7 @@
       </w:pPr>
       <w:r>
         <w:rPr>
+          <w:noProof/>
           <w:sz w:val="24"/>
           <w:szCs w:val="24"/>
         </w:rPr>
@@ -14053,6 +14058,7 @@
       </w:pPr>
       <w:r>
         <w:rPr>
+          <w:noProof/>
           <w:sz w:val="24"/>
           <w:szCs w:val="24"/>
         </w:rPr>
@@ -14246,6 +14252,7 @@
       </w:r>
       <w:r>
         <w:rPr>
+          <w:noProof/>
           <w:sz w:val="24"/>
           <w:szCs w:val="24"/>
         </w:rPr>
@@ -14353,6 +14360,7 @@
       </w:pPr>
       <w:r>
         <w:rPr>
+          <w:noProof/>
           <w:sz w:val="24"/>
           <w:szCs w:val="24"/>
         </w:rPr>
@@ -14456,6 +14464,7 @@
       </w:pPr>
       <w:r>
         <w:rPr>
+          <w:noProof/>
           <w:sz w:val="24"/>
           <w:szCs w:val="24"/>
         </w:rPr>
@@ -14575,6 +14584,7 @@
       </w:pPr>
       <w:r>
         <w:rPr>
+          <w:noProof/>
           <w:sz w:val="24"/>
           <w:szCs w:val="24"/>
         </w:rPr>
@@ -14628,6 +14638,7 @@
       </w:pPr>
       <w:r>
         <w:rPr>
+          <w:noProof/>
           <w:sz w:val="24"/>
           <w:szCs w:val="24"/>
         </w:rPr>
@@ -14667,8 +14678,1142 @@
           </wp:inline>
         </w:drawing>
       </w:r>
+    </w:p>
+    <w:p>
+      <w:pPr>
+        <w:pStyle w:val="PargrafodaLista"/>
+        <w:tabs>
+          <w:tab w:val="left" w:pos="1275"/>
+        </w:tabs>
+        <w:rPr>
+          <w:sz w:val="24"/>
+          <w:szCs w:val="24"/>
+        </w:rPr>
+      </w:pPr>
+    </w:p>
+    <w:p>
+      <w:pPr>
+        <w:pStyle w:val="PargrafodaLista"/>
+        <w:tabs>
+          <w:tab w:val="left" w:pos="1275"/>
+        </w:tabs>
+        <w:rPr>
+          <w:sz w:val="24"/>
+          <w:szCs w:val="24"/>
+        </w:rPr>
+      </w:pPr>
+    </w:p>
+    <w:p>
+      <w:pPr>
+        <w:pStyle w:val="PargrafodaLista"/>
+        <w:tabs>
+          <w:tab w:val="left" w:pos="1275"/>
+        </w:tabs>
+        <w:rPr>
+          <w:sz w:val="24"/>
+          <w:szCs w:val="24"/>
+        </w:rPr>
+      </w:pPr>
+      <w:r>
+        <w:rPr>
+          <w:sz w:val="24"/>
+          <w:szCs w:val="24"/>
+        </w:rPr>
+        <w:t xml:space="preserve">71- Para colocar o texto ao lado da imagem utilizamos a técnica </w:t>
+      </w:r>
+      <w:proofErr w:type="spellStart"/>
+      <w:r>
+        <w:rPr>
+          <w:sz w:val="24"/>
+          <w:szCs w:val="24"/>
+        </w:rPr>
+        <w:t>float:left</w:t>
+      </w:r>
+      <w:proofErr w:type="spellEnd"/>
+      <w:r>
+        <w:rPr>
+          <w:sz w:val="24"/>
+          <w:szCs w:val="24"/>
+        </w:rPr>
+        <w:t xml:space="preserve"> que faz o seguinte:</w:t>
+      </w:r>
+    </w:p>
+    <w:p>
+      <w:pPr>
+        <w:pStyle w:val="PargrafodaLista"/>
+        <w:numPr>
+          <w:ilvl w:val="0"/>
+          <w:numId w:val="4"/>
+        </w:numPr>
+        <w:tabs>
+          <w:tab w:val="left" w:pos="1275"/>
+        </w:tabs>
+        <w:rPr>
+          <w:sz w:val="24"/>
+          <w:szCs w:val="24"/>
+        </w:rPr>
+      </w:pPr>
+      <w:r>
+        <w:rPr>
+          <w:sz w:val="24"/>
+          <w:szCs w:val="24"/>
+        </w:rPr>
+        <w:t xml:space="preserve">Como o nome indica </w:t>
+      </w:r>
+      <w:proofErr w:type="spellStart"/>
+      <w:r>
+        <w:rPr>
+          <w:sz w:val="24"/>
+          <w:szCs w:val="24"/>
+        </w:rPr>
+        <w:t>float</w:t>
+      </w:r>
+      <w:proofErr w:type="spellEnd"/>
+      <w:r>
+        <w:rPr>
+          <w:sz w:val="24"/>
+          <w:szCs w:val="24"/>
+        </w:rPr>
+        <w:t xml:space="preserve"> a imagem flutua e o texto a baixo sobe para ficar ao lado </w:t>
+      </w:r>
+    </w:p>
+    <w:p>
+      <w:pPr>
+        <w:pStyle w:val="PargrafodaLista"/>
+        <w:tabs>
+          <w:tab w:val="left" w:pos="1275"/>
+        </w:tabs>
+        <w:rPr>
+          <w:sz w:val="24"/>
+          <w:szCs w:val="24"/>
+        </w:rPr>
+      </w:pPr>
+    </w:p>
+    <w:p>
+      <w:pPr>
+        <w:pStyle w:val="PargrafodaLista"/>
+        <w:tabs>
+          <w:tab w:val="left" w:pos="1275"/>
+        </w:tabs>
+        <w:rPr>
+          <w:sz w:val="24"/>
+          <w:szCs w:val="24"/>
+        </w:rPr>
+      </w:pPr>
+      <w:r>
+        <w:rPr>
+          <w:noProof/>
+          <w:sz w:val="24"/>
+          <w:szCs w:val="24"/>
+        </w:rPr>
+        <mc:AlternateContent>
+          <mc:Choice Requires="wps">
+            <w:drawing>
+              <wp:anchor distT="0" distB="0" distL="114300" distR="114300" simplePos="0" relativeHeight="251692032" behindDoc="0" locked="0" layoutInCell="1" allowOverlap="1">
+                <wp:simplePos x="0" y="0"/>
+                <wp:positionH relativeFrom="column">
+                  <wp:posOffset>2490001</wp:posOffset>
+                </wp:positionH>
+                <wp:positionV relativeFrom="paragraph">
+                  <wp:posOffset>29762</wp:posOffset>
+                </wp:positionV>
+                <wp:extent cx="985961" cy="731520"/>
+                <wp:effectExtent l="38100" t="0" r="24130" b="49530"/>
+                <wp:wrapNone/>
+                <wp:docPr id="134" name="Conector de Seta Reta 134"/>
+                <wp:cNvGraphicFramePr/>
+                <a:graphic xmlns:a="http://schemas.openxmlformats.org/drawingml/2006/main">
+                  <a:graphicData uri="http://schemas.microsoft.com/office/word/2010/wordprocessingShape">
+                    <wps:wsp>
+                      <wps:cNvCnPr/>
+                      <wps:spPr>
+                        <a:xfrm flipH="1">
+                          <a:off x="0" y="0"/>
+                          <a:ext cx="985961" cy="731520"/>
+                        </a:xfrm>
+                        <a:prstGeom prst="straightConnector1">
+                          <a:avLst/>
+                        </a:prstGeom>
+                        <a:ln>
+                          <a:tailEnd type="triangle"/>
+                        </a:ln>
+                      </wps:spPr>
+                      <wps:style>
+                        <a:lnRef idx="1">
+                          <a:schemeClr val="accent1"/>
+                        </a:lnRef>
+                        <a:fillRef idx="0">
+                          <a:schemeClr val="accent1"/>
+                        </a:fillRef>
+                        <a:effectRef idx="0">
+                          <a:schemeClr val="accent1"/>
+                        </a:effectRef>
+                        <a:fontRef idx="minor">
+                          <a:schemeClr val="tx1"/>
+                        </a:fontRef>
+                      </wps:style>
+                      <wps:bodyPr/>
+                    </wps:wsp>
+                  </a:graphicData>
+                </a:graphic>
+              </wp:anchor>
+            </w:drawing>
+          </mc:Choice>
+          <mc:Fallback>
+            <w:pict>
+              <v:shapetype w14:anchorId="1FA5CF4B" id="_x0000_t32" coordsize="21600,21600" o:spt="32" o:oned="t" path="m,l21600,21600e" filled="f">
+                <v:path arrowok="t" fillok="f" o:connecttype="none"/>
+                <o:lock v:ext="edit" shapetype="t"/>
+              </v:shapetype>
+              <v:shape id="Conector de Seta Reta 134" o:spid="_x0000_s1026" type="#_x0000_t32" style="position:absolute;margin-left:196.05pt;margin-top:2.35pt;width:77.65pt;height:57.6pt;flip:x;z-index:251692032;visibility:visible;mso-wrap-style:square;mso-wrap-distance-left:9pt;mso-wrap-distance-top:0;mso-wrap-distance-right:9pt;mso-wrap-distance-bottom:0;mso-position-horizontal:absolute;mso-position-horizontal-relative:text;mso-position-vertical:absolute;mso-position-vertical-relative:text" o:gfxdata="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" strokecolor="#4472c4 [3204]" strokeweight=".5pt">
+                <v:stroke endarrow="block" joinstyle="miter"/>
+              </v:shape>
+            </w:pict>
+          </mc:Fallback>
+        </mc:AlternateContent>
+      </w:r>
+      <w:r>
+        <w:rPr>
+          <w:sz w:val="24"/>
+          <w:szCs w:val="24"/>
+        </w:rPr>
+        <w:drawing>
+          <wp:inline distT="0" distB="0" distL="0" distR="0" wp14:anchorId="4A407C84" wp14:editId="43B47525">
+            <wp:extent cx="3038899" cy="1457528"/>
+            <wp:effectExtent l="0" t="0" r="9525" b="9525"/>
+            <wp:docPr id="133" name="Imagem 133"/>
+            <wp:cNvGraphicFramePr>
+              <a:graphicFrameLocks xmlns:a="http://schemas.openxmlformats.org/drawingml/2006/main" noChangeAspect="1"/>
+            </wp:cNvGraphicFramePr>
+            <a:graphic xmlns:a="http://schemas.openxmlformats.org/drawingml/2006/main">
+              <a:graphicData uri="http://schemas.openxmlformats.org/drawingml/2006/picture">
+                <pic:pic xmlns:pic="http://schemas.openxmlformats.org/drawingml/2006/picture">
+                  <pic:nvPicPr>
+                    <pic:cNvPr id="1" name=""/>
+                    <pic:cNvPicPr/>
+                  </pic:nvPicPr>
+                  <pic:blipFill>
+                    <a:blip r:embed="rId109"/>
+                    <a:stretch>
+                      <a:fillRect/>
+                    </a:stretch>
+                  </pic:blipFill>
+                  <pic:spPr>
+                    <a:xfrm>
+                      <a:off x="0" y="0"/>
+                      <a:ext cx="3038899" cy="1457528"/>
+                    </a:xfrm>
+                    <a:prstGeom prst="rect">
+                      <a:avLst/>
+                    </a:prstGeom>
+                  </pic:spPr>
+                </pic:pic>
+              </a:graphicData>
+            </a:graphic>
+          </wp:inline>
+        </w:drawing>
+      </w:r>
+    </w:p>
+    <w:p>
+      <w:pPr>
+        <w:pStyle w:val="PargrafodaLista"/>
+        <w:tabs>
+          <w:tab w:val="left" w:pos="1275"/>
+        </w:tabs>
+        <w:rPr>
+          <w:sz w:val="24"/>
+          <w:szCs w:val="24"/>
+        </w:rPr>
+      </w:pPr>
+      <w:r>
+        <w:rPr>
+          <w:sz w:val="24"/>
+          <w:szCs w:val="24"/>
+        </w:rPr>
+        <w:drawing>
+          <wp:inline distT="0" distB="0" distL="0" distR="0" wp14:anchorId="4ECA3194" wp14:editId="3DDCE2EB">
+            <wp:extent cx="5400040" cy="891540"/>
+            <wp:effectExtent l="0" t="0" r="0" b="3810"/>
+            <wp:docPr id="135" name="Imagem 135"/>
+            <wp:cNvGraphicFramePr>
+              <a:graphicFrameLocks xmlns:a="http://schemas.openxmlformats.org/drawingml/2006/main" noChangeAspect="1"/>
+            </wp:cNvGraphicFramePr>
+            <a:graphic xmlns:a="http://schemas.openxmlformats.org/drawingml/2006/main">
+              <a:graphicData uri="http://schemas.openxmlformats.org/drawingml/2006/picture">
+                <pic:pic xmlns:pic="http://schemas.openxmlformats.org/drawingml/2006/picture">
+                  <pic:nvPicPr>
+                    <pic:cNvPr id="1" name=""/>
+                    <pic:cNvPicPr/>
+                  </pic:nvPicPr>
+                  <pic:blipFill>
+                    <a:blip r:embed="rId110"/>
+                    <a:stretch>
+                      <a:fillRect/>
+                    </a:stretch>
+                  </pic:blipFill>
+                  <pic:spPr>
+                    <a:xfrm>
+                      <a:off x="0" y="0"/>
+                      <a:ext cx="5400040" cy="891540"/>
+                    </a:xfrm>
+                    <a:prstGeom prst="rect">
+                      <a:avLst/>
+                    </a:prstGeom>
+                  </pic:spPr>
+                </pic:pic>
+              </a:graphicData>
+            </a:graphic>
+          </wp:inline>
+        </w:drawing>
+      </w:r>
+    </w:p>
+    <w:p>
+      <w:pPr>
+        <w:pStyle w:val="PargrafodaLista"/>
+        <w:tabs>
+          <w:tab w:val="left" w:pos="1275"/>
+        </w:tabs>
+        <w:rPr>
+          <w:sz w:val="24"/>
+          <w:szCs w:val="24"/>
+        </w:rPr>
+      </w:pPr>
+    </w:p>
+    <w:p>
+      <w:pPr>
+        <w:pStyle w:val="PargrafodaLista"/>
+        <w:tabs>
+          <w:tab w:val="left" w:pos="1275"/>
+        </w:tabs>
+        <w:rPr>
+          <w:sz w:val="24"/>
+          <w:szCs w:val="24"/>
+        </w:rPr>
+      </w:pPr>
+    </w:p>
+    <w:p>
+      <w:pPr>
+        <w:pStyle w:val="PargrafodaLista"/>
+        <w:tabs>
+          <w:tab w:val="left" w:pos="1275"/>
+        </w:tabs>
+        <w:rPr>
+          <w:sz w:val="24"/>
+          <w:szCs w:val="24"/>
+        </w:rPr>
+      </w:pPr>
+    </w:p>
+    <w:p>
+      <w:pPr>
+        <w:pStyle w:val="PargrafodaLista"/>
+        <w:tabs>
+          <w:tab w:val="left" w:pos="1275"/>
+        </w:tabs>
+        <w:rPr>
+          <w:sz w:val="24"/>
+          <w:szCs w:val="24"/>
+        </w:rPr>
+      </w:pPr>
+      <w:r>
+        <w:rPr>
+          <w:sz w:val="24"/>
+          <w:szCs w:val="24"/>
+        </w:rPr>
+        <w:lastRenderedPageBreak/>
+        <w:t xml:space="preserve">72- Utilizamos o </w:t>
+      </w:r>
+      <w:proofErr w:type="spellStart"/>
+      <w:r>
+        <w:rPr>
+          <w:sz w:val="24"/>
+          <w:szCs w:val="24"/>
+        </w:rPr>
+        <w:t>clear:left</w:t>
+      </w:r>
+      <w:proofErr w:type="spellEnd"/>
+      <w:r>
+        <w:rPr>
+          <w:sz w:val="24"/>
+          <w:szCs w:val="24"/>
+        </w:rPr>
+        <w:t xml:space="preserve"> para retornar </w:t>
+      </w:r>
+      <w:proofErr w:type="gramStart"/>
+      <w:r>
+        <w:rPr>
+          <w:sz w:val="24"/>
+          <w:szCs w:val="24"/>
+        </w:rPr>
+        <w:t>a</w:t>
+      </w:r>
+      <w:proofErr w:type="gramEnd"/>
+      <w:r>
+        <w:rPr>
+          <w:sz w:val="24"/>
+          <w:szCs w:val="24"/>
+        </w:rPr>
+        <w:t xml:space="preserve"> posição dos elementos abaixo da imagem que utilizamos o </w:t>
+      </w:r>
+      <w:proofErr w:type="spellStart"/>
+      <w:r>
+        <w:rPr>
+          <w:sz w:val="24"/>
+          <w:szCs w:val="24"/>
+        </w:rPr>
+        <w:t>float:left</w:t>
+      </w:r>
+      <w:proofErr w:type="spellEnd"/>
+      <w:r>
+        <w:rPr>
+          <w:sz w:val="24"/>
+          <w:szCs w:val="24"/>
+        </w:rPr>
+        <w:t xml:space="preserve"> ou seja</w:t>
+      </w:r>
+      <w:r>
+        <w:rPr>
+          <w:sz w:val="24"/>
+          <w:szCs w:val="24"/>
+        </w:rPr>
+        <w:t>.</w:t>
+      </w:r>
+    </w:p>
+    <w:p>
+      <w:pPr>
+        <w:pStyle w:val="PargrafodaLista"/>
+        <w:tabs>
+          <w:tab w:val="left" w:pos="1275"/>
+        </w:tabs>
+        <w:rPr>
+          <w:sz w:val="24"/>
+          <w:szCs w:val="24"/>
+        </w:rPr>
+      </w:pPr>
+      <w:r>
+        <w:rPr>
+          <w:sz w:val="24"/>
+          <w:szCs w:val="24"/>
+        </w:rPr>
+        <w:t xml:space="preserve">Quando utilizamos o </w:t>
+      </w:r>
+      <w:proofErr w:type="spellStart"/>
+      <w:r>
+        <w:rPr>
+          <w:sz w:val="24"/>
+          <w:szCs w:val="24"/>
+        </w:rPr>
+        <w:t>float</w:t>
+      </w:r>
+      <w:proofErr w:type="spellEnd"/>
+      <w:r>
+        <w:rPr>
+          <w:sz w:val="24"/>
+          <w:szCs w:val="24"/>
+        </w:rPr>
+        <w:t xml:space="preserve"> </w:t>
+      </w:r>
+      <w:proofErr w:type="spellStart"/>
+      <w:r>
+        <w:rPr>
+          <w:sz w:val="24"/>
+          <w:szCs w:val="24"/>
+        </w:rPr>
+        <w:t>left</w:t>
+      </w:r>
+      <w:proofErr w:type="spellEnd"/>
+      <w:r>
+        <w:rPr>
+          <w:sz w:val="24"/>
+          <w:szCs w:val="24"/>
+        </w:rPr>
+        <w:t xml:space="preserve"> ele sobe </w:t>
+      </w:r>
+      <w:r>
+        <w:rPr>
+          <w:sz w:val="24"/>
+          <w:szCs w:val="24"/>
+        </w:rPr>
+        <w:t>todos elementos</w:t>
+      </w:r>
+      <w:r>
+        <w:rPr>
+          <w:sz w:val="24"/>
+          <w:szCs w:val="24"/>
+        </w:rPr>
+        <w:t xml:space="preserve">  a baixo para retornar utilizamos </w:t>
+      </w:r>
+      <w:proofErr w:type="spellStart"/>
+      <w:r>
+        <w:rPr>
+          <w:sz w:val="24"/>
+          <w:szCs w:val="24"/>
+        </w:rPr>
+        <w:t>clear:left</w:t>
+      </w:r>
+      <w:proofErr w:type="spellEnd"/>
+      <w:r>
+        <w:rPr>
+          <w:sz w:val="24"/>
+          <w:szCs w:val="24"/>
+        </w:rPr>
+        <w:t>.</w:t>
+      </w:r>
+    </w:p>
+    <w:p>
+      <w:pPr>
+        <w:pStyle w:val="PargrafodaLista"/>
+        <w:tabs>
+          <w:tab w:val="left" w:pos="1275"/>
+        </w:tabs>
+        <w:rPr>
+          <w:sz w:val="24"/>
+          <w:szCs w:val="24"/>
+        </w:rPr>
+      </w:pPr>
+    </w:p>
+    <w:p>
+      <w:pPr>
+        <w:pStyle w:val="PargrafodaLista"/>
+        <w:tabs>
+          <w:tab w:val="left" w:pos="1275"/>
+        </w:tabs>
+        <w:rPr>
+          <w:sz w:val="24"/>
+          <w:szCs w:val="24"/>
+        </w:rPr>
+      </w:pPr>
+      <w:r>
+        <w:rPr>
+          <w:noProof/>
+          <w:sz w:val="24"/>
+          <w:szCs w:val="24"/>
+        </w:rPr>
+        <mc:AlternateContent>
+          <mc:Choice Requires="wps">
+            <w:drawing>
+              <wp:anchor distT="0" distB="0" distL="114300" distR="114300" simplePos="0" relativeHeight="251693056" behindDoc="0" locked="0" layoutInCell="1" allowOverlap="1">
+                <wp:simplePos x="0" y="0"/>
+                <wp:positionH relativeFrom="column">
+                  <wp:posOffset>2482049</wp:posOffset>
+                </wp:positionH>
+                <wp:positionV relativeFrom="paragraph">
+                  <wp:posOffset>1292694</wp:posOffset>
+                </wp:positionV>
+                <wp:extent cx="922352" cy="230588"/>
+                <wp:effectExtent l="38100" t="0" r="30480" b="74295"/>
+                <wp:wrapNone/>
+                <wp:docPr id="138" name="Conector de Seta Reta 138"/>
+                <wp:cNvGraphicFramePr/>
+                <a:graphic xmlns:a="http://schemas.openxmlformats.org/drawingml/2006/main">
+                  <a:graphicData uri="http://schemas.microsoft.com/office/word/2010/wordprocessingShape">
+                    <wps:wsp>
+                      <wps:cNvCnPr/>
+                      <wps:spPr>
+                        <a:xfrm flipH="1">
+                          <a:off x="0" y="0"/>
+                          <a:ext cx="922352" cy="230588"/>
+                        </a:xfrm>
+                        <a:prstGeom prst="straightConnector1">
+                          <a:avLst/>
+                        </a:prstGeom>
+                        <a:ln>
+                          <a:tailEnd type="triangle"/>
+                        </a:ln>
+                      </wps:spPr>
+                      <wps:style>
+                        <a:lnRef idx="1">
+                          <a:schemeClr val="accent1"/>
+                        </a:lnRef>
+                        <a:fillRef idx="0">
+                          <a:schemeClr val="accent1"/>
+                        </a:fillRef>
+                        <a:effectRef idx="0">
+                          <a:schemeClr val="accent1"/>
+                        </a:effectRef>
+                        <a:fontRef idx="minor">
+                          <a:schemeClr val="tx1"/>
+                        </a:fontRef>
+                      </wps:style>
+                      <wps:bodyPr/>
+                    </wps:wsp>
+                  </a:graphicData>
+                </a:graphic>
+              </wp:anchor>
+            </w:drawing>
+          </mc:Choice>
+          <mc:Fallback>
+            <w:pict>
+              <v:shape w14:anchorId="68B4F274" id="Conector de Seta Reta 138" o:spid="_x0000_s1026" type="#_x0000_t32" style="position:absolute;margin-left:195.45pt;margin-top:101.8pt;width:72.65pt;height:18.15pt;flip:x;z-index:251693056;visibility:visible;mso-wrap-style:square;mso-wrap-distance-left:9pt;mso-wrap-distance-top:0;mso-wrap-distance-right:9pt;mso-wrap-distance-bottom:0;mso-position-horizontal:absolute;mso-position-horizontal-relative:text;mso-position-vertical:absolute;mso-position-vertical-relative:text" o:gfxdata="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" strokecolor="#4472c4 [3204]" strokeweight=".5pt">
+                <v:stroke endarrow="block" joinstyle="miter"/>
+              </v:shape>
+            </w:pict>
+          </mc:Fallback>
+        </mc:AlternateContent>
+      </w:r>
+      <w:r>
+        <w:rPr>
+          <w:sz w:val="24"/>
+          <w:szCs w:val="24"/>
+        </w:rPr>
+        <w:drawing>
+          <wp:inline distT="0" distB="0" distL="0" distR="0" wp14:anchorId="2AD8BA75" wp14:editId="5EC4D856">
+            <wp:extent cx="3048425" cy="2267266"/>
+            <wp:effectExtent l="0" t="0" r="0" b="0"/>
+            <wp:docPr id="137" name="Imagem 137"/>
+            <wp:cNvGraphicFramePr>
+              <a:graphicFrameLocks xmlns:a="http://schemas.openxmlformats.org/drawingml/2006/main" noChangeAspect="1"/>
+            </wp:cNvGraphicFramePr>
+            <a:graphic xmlns:a="http://schemas.openxmlformats.org/drawingml/2006/main">
+              <a:graphicData uri="http://schemas.openxmlformats.org/drawingml/2006/picture">
+                <pic:pic xmlns:pic="http://schemas.openxmlformats.org/drawingml/2006/picture">
+                  <pic:nvPicPr>
+                    <pic:cNvPr id="1" name=""/>
+                    <pic:cNvPicPr/>
+                  </pic:nvPicPr>
+                  <pic:blipFill>
+                    <a:blip r:embed="rId111"/>
+                    <a:stretch>
+                      <a:fillRect/>
+                    </a:stretch>
+                  </pic:blipFill>
+                  <pic:spPr>
+                    <a:xfrm>
+                      <a:off x="0" y="0"/>
+                      <a:ext cx="3048425" cy="2267266"/>
+                    </a:xfrm>
+                    <a:prstGeom prst="rect">
+                      <a:avLst/>
+                    </a:prstGeom>
+                  </pic:spPr>
+                </pic:pic>
+              </a:graphicData>
+            </a:graphic>
+          </wp:inline>
+        </w:drawing>
+      </w:r>
+    </w:p>
+    <w:p>
+      <w:pPr>
+        <w:pStyle w:val="PargrafodaLista"/>
+        <w:tabs>
+          <w:tab w:val="left" w:pos="1275"/>
+        </w:tabs>
+        <w:rPr>
+          <w:sz w:val="24"/>
+          <w:szCs w:val="24"/>
+        </w:rPr>
+      </w:pPr>
+    </w:p>
+    <w:p>
+      <w:pPr>
+        <w:pStyle w:val="PargrafodaLista"/>
+        <w:tabs>
+          <w:tab w:val="left" w:pos="1275"/>
+        </w:tabs>
+        <w:rPr>
+          <w:sz w:val="24"/>
+          <w:szCs w:val="24"/>
+        </w:rPr>
+      </w:pPr>
+    </w:p>
+    <w:p>
+      <w:pPr>
+        <w:pStyle w:val="PargrafodaLista"/>
+        <w:tabs>
+          <w:tab w:val="left" w:pos="1275"/>
+        </w:tabs>
+        <w:rPr>
+          <w:sz w:val="24"/>
+          <w:szCs w:val="24"/>
+        </w:rPr>
+      </w:pPr>
+      <w:r>
+        <w:rPr>
+          <w:sz w:val="24"/>
+          <w:szCs w:val="24"/>
+        </w:rPr>
+        <w:t xml:space="preserve">73 - </w:t>
+      </w:r>
+      <w:r>
+        <w:rPr>
+          <w:sz w:val="24"/>
+          <w:szCs w:val="24"/>
+        </w:rPr>
+        <w:t xml:space="preserve"> Para troca a fonte dos sites realizamos os seguintes passos:</w:t>
+      </w:r>
+    </w:p>
+    <w:p>
+      <w:pPr>
+        <w:pStyle w:val="PargrafodaLista"/>
+        <w:tabs>
+          <w:tab w:val="left" w:pos="1275"/>
+        </w:tabs>
+        <w:rPr>
+          <w:sz w:val="24"/>
+          <w:szCs w:val="24"/>
+        </w:rPr>
+      </w:pPr>
+    </w:p>
+    <w:p>
+      <w:pPr>
+        <w:pStyle w:val="PargrafodaLista"/>
+        <w:numPr>
+          <w:ilvl w:val="0"/>
+          <w:numId w:val="4"/>
+        </w:numPr>
+        <w:tabs>
+          <w:tab w:val="left" w:pos="1275"/>
+        </w:tabs>
+        <w:rPr>
+          <w:sz w:val="24"/>
+          <w:szCs w:val="24"/>
+        </w:rPr>
+      </w:pPr>
+      <w:r>
+        <w:rPr>
+          <w:sz w:val="24"/>
+          <w:szCs w:val="24"/>
+        </w:rPr>
+        <w:t xml:space="preserve">Entra no site do </w:t>
+      </w:r>
+      <w:proofErr w:type="spellStart"/>
+      <w:r>
+        <w:rPr>
+          <w:sz w:val="24"/>
+          <w:szCs w:val="24"/>
+        </w:rPr>
+        <w:t>google</w:t>
+      </w:r>
+      <w:proofErr w:type="spellEnd"/>
+      <w:r>
+        <w:rPr>
+          <w:sz w:val="24"/>
+          <w:szCs w:val="24"/>
+        </w:rPr>
+        <w:t xml:space="preserve"> </w:t>
+      </w:r>
+      <w:proofErr w:type="spellStart"/>
+      <w:r>
+        <w:rPr>
+          <w:sz w:val="24"/>
+          <w:szCs w:val="24"/>
+        </w:rPr>
+        <w:t>fonts</w:t>
+      </w:r>
+      <w:proofErr w:type="spellEnd"/>
+      <w:r>
+        <w:rPr>
+          <w:sz w:val="24"/>
+          <w:szCs w:val="24"/>
+        </w:rPr>
+        <w:t>(</w:t>
+      </w:r>
+      <w:hyperlink r:id="rId112" w:history="1">
+        <w:r>
+          <w:rPr>
+            <w:rStyle w:val="Hyperlink"/>
+            <w:sz w:val="24"/>
+            <w:szCs w:val="24"/>
+          </w:rPr>
+          <w:t>https://fonts.google.com</w:t>
+        </w:r>
+      </w:hyperlink>
+      <w:r>
+        <w:rPr>
+          <w:sz w:val="24"/>
+          <w:szCs w:val="24"/>
+        </w:rPr>
+        <w:t>)</w:t>
+      </w:r>
+    </w:p>
+    <w:p>
+      <w:pPr>
+        <w:pStyle w:val="PargrafodaLista"/>
+        <w:numPr>
+          <w:ilvl w:val="0"/>
+          <w:numId w:val="4"/>
+        </w:numPr>
+        <w:tabs>
+          <w:tab w:val="left" w:pos="1275"/>
+        </w:tabs>
+        <w:rPr>
+          <w:sz w:val="24"/>
+          <w:szCs w:val="24"/>
+        </w:rPr>
+      </w:pPr>
+      <w:r>
+        <w:rPr>
+          <w:sz w:val="24"/>
+          <w:szCs w:val="24"/>
+        </w:rPr>
+        <w:t xml:space="preserve">Escolhe a </w:t>
+      </w:r>
+      <w:proofErr w:type="spellStart"/>
+      <w:r>
+        <w:rPr>
+          <w:sz w:val="24"/>
+          <w:szCs w:val="24"/>
+        </w:rPr>
+        <w:t>font</w:t>
+      </w:r>
+      <w:proofErr w:type="spellEnd"/>
+      <w:r>
+        <w:rPr>
+          <w:sz w:val="24"/>
+          <w:szCs w:val="24"/>
+        </w:rPr>
+        <w:t xml:space="preserve"> desejada para aplicar ao site.</w:t>
+      </w:r>
+    </w:p>
+    <w:p>
+      <w:pPr>
+        <w:pStyle w:val="PargrafodaLista"/>
+        <w:numPr>
+          <w:ilvl w:val="0"/>
+          <w:numId w:val="4"/>
+        </w:numPr>
+        <w:tabs>
+          <w:tab w:val="left" w:pos="1275"/>
+        </w:tabs>
+        <w:rPr>
+          <w:sz w:val="24"/>
+          <w:szCs w:val="24"/>
+        </w:rPr>
+      </w:pPr>
+      <w:r>
+        <w:rPr>
+          <w:sz w:val="24"/>
+          <w:szCs w:val="24"/>
+        </w:rPr>
+        <w:t xml:space="preserve">Clicar no botão </w:t>
+      </w:r>
+      <w:proofErr w:type="spellStart"/>
+      <w:r>
+        <w:rPr>
+          <w:sz w:val="24"/>
+          <w:szCs w:val="24"/>
+        </w:rPr>
+        <w:t>get</w:t>
+      </w:r>
+      <w:proofErr w:type="spellEnd"/>
+      <w:r>
+        <w:rPr>
+          <w:sz w:val="24"/>
+          <w:szCs w:val="24"/>
+        </w:rPr>
+        <w:t xml:space="preserve"> </w:t>
+      </w:r>
+      <w:proofErr w:type="spellStart"/>
+      <w:r>
+        <w:rPr>
+          <w:sz w:val="24"/>
+          <w:szCs w:val="24"/>
+        </w:rPr>
+        <w:t>fonts</w:t>
+      </w:r>
+      <w:proofErr w:type="spellEnd"/>
+      <w:r>
+        <w:rPr>
+          <w:sz w:val="24"/>
+          <w:szCs w:val="24"/>
+        </w:rPr>
+        <w:t xml:space="preserve"> para copiar o link que será colado no </w:t>
+      </w:r>
+      <w:proofErr w:type="spellStart"/>
+      <w:r>
+        <w:rPr>
+          <w:sz w:val="24"/>
+          <w:szCs w:val="24"/>
+        </w:rPr>
+        <w:t>head</w:t>
+      </w:r>
+      <w:proofErr w:type="spellEnd"/>
+      <w:r>
+        <w:rPr>
+          <w:sz w:val="24"/>
+          <w:szCs w:val="24"/>
+        </w:rPr>
+        <w:t xml:space="preserve"> do </w:t>
+      </w:r>
+      <w:proofErr w:type="spellStart"/>
+      <w:r>
+        <w:rPr>
+          <w:sz w:val="24"/>
+          <w:szCs w:val="24"/>
+        </w:rPr>
+        <w:t>html</w:t>
+      </w:r>
+      <w:proofErr w:type="spellEnd"/>
+      <w:r>
+        <w:rPr>
+          <w:sz w:val="24"/>
+          <w:szCs w:val="24"/>
+        </w:rPr>
+        <w:t>.</w:t>
+      </w:r>
+    </w:p>
+    <w:p>
+      <w:pPr>
+        <w:pStyle w:val="PargrafodaLista"/>
+        <w:numPr>
+          <w:ilvl w:val="0"/>
+          <w:numId w:val="4"/>
+        </w:numPr>
+        <w:tabs>
+          <w:tab w:val="left" w:pos="1275"/>
+        </w:tabs>
+        <w:rPr>
+          <w:sz w:val="24"/>
+          <w:szCs w:val="24"/>
+        </w:rPr>
+      </w:pPr>
+      <w:r>
+        <w:rPr>
+          <w:sz w:val="24"/>
+          <w:szCs w:val="24"/>
+        </w:rPr>
+        <w:t xml:space="preserve">Depois copiamos o link que será colocado no </w:t>
+      </w:r>
+      <w:proofErr w:type="spellStart"/>
+      <w:r>
+        <w:rPr>
+          <w:sz w:val="24"/>
+          <w:szCs w:val="24"/>
+        </w:rPr>
+        <w:t>Css</w:t>
+      </w:r>
+      <w:proofErr w:type="spellEnd"/>
+      <w:r>
+        <w:rPr>
+          <w:sz w:val="24"/>
+          <w:szCs w:val="24"/>
+        </w:rPr>
+        <w:t>.</w:t>
+      </w:r>
+    </w:p>
+    <w:p>
+      <w:pPr>
+        <w:pStyle w:val="PargrafodaLista"/>
+        <w:tabs>
+          <w:tab w:val="left" w:pos="1275"/>
+        </w:tabs>
+        <w:rPr>
+          <w:sz w:val="24"/>
+          <w:szCs w:val="24"/>
+        </w:rPr>
+      </w:pPr>
+      <w:r>
+        <w:rPr>
+          <w:noProof/>
+          <w:sz w:val="24"/>
+          <w:szCs w:val="24"/>
+        </w:rPr>
+        <mc:AlternateContent>
+          <mc:Choice Requires="wps">
+            <w:drawing>
+              <wp:anchor distT="0" distB="0" distL="114300" distR="114300" simplePos="0" relativeHeight="251694080" behindDoc="0" locked="0" layoutInCell="1" allowOverlap="1">
+                <wp:simplePos x="0" y="0"/>
+                <wp:positionH relativeFrom="column">
+                  <wp:posOffset>1877750</wp:posOffset>
+                </wp:positionH>
+                <wp:positionV relativeFrom="paragraph">
+                  <wp:posOffset>131941</wp:posOffset>
+                </wp:positionV>
+                <wp:extent cx="3824578" cy="1017767"/>
+                <wp:effectExtent l="38100" t="0" r="24130" b="68580"/>
+                <wp:wrapNone/>
+                <wp:docPr id="140" name="Conector de Seta Reta 140"/>
+                <wp:cNvGraphicFramePr/>
+                <a:graphic xmlns:a="http://schemas.openxmlformats.org/drawingml/2006/main">
+                  <a:graphicData uri="http://schemas.microsoft.com/office/word/2010/wordprocessingShape">
+                    <wps:wsp>
+                      <wps:cNvCnPr/>
+                      <wps:spPr>
+                        <a:xfrm flipH="1">
+                          <a:off x="0" y="0"/>
+                          <a:ext cx="3824578" cy="1017767"/>
+                        </a:xfrm>
+                        <a:prstGeom prst="straightConnector1">
+                          <a:avLst/>
+                        </a:prstGeom>
+                        <a:ln>
+                          <a:tailEnd type="triangle"/>
+                        </a:ln>
+                      </wps:spPr>
+                      <wps:style>
+                        <a:lnRef idx="1">
+                          <a:schemeClr val="accent1"/>
+                        </a:lnRef>
+                        <a:fillRef idx="0">
+                          <a:schemeClr val="accent1"/>
+                        </a:fillRef>
+                        <a:effectRef idx="0">
+                          <a:schemeClr val="accent1"/>
+                        </a:effectRef>
+                        <a:fontRef idx="minor">
+                          <a:schemeClr val="tx1"/>
+                        </a:fontRef>
+                      </wps:style>
+                      <wps:bodyPr/>
+                    </wps:wsp>
+                  </a:graphicData>
+                </a:graphic>
+              </wp:anchor>
+            </w:drawing>
+          </mc:Choice>
+          <mc:Fallback>
+            <w:pict>
+              <v:shape w14:anchorId="29EC322B" id="Conector de Seta Reta 140" o:spid="_x0000_s1026" type="#_x0000_t32" style="position:absolute;margin-left:147.85pt;margin-top:10.4pt;width:301.15pt;height:80.15pt;flip:x;z-index:251694080;visibility:visible;mso-wrap-style:square;mso-wrap-distance-left:9pt;mso-wrap-distance-top:0;mso-wrap-distance-right:9pt;mso-wrap-distance-bottom:0;mso-position-horizontal:absolute;mso-position-horizontal-relative:text;mso-position-vertical:absolute;mso-position-vertical-relative:text" o:gfxdata="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" strokecolor="#4472c4 [3204]" strokeweight=".5pt">
+                <v:stroke endarrow="block" joinstyle="miter"/>
+              </v:shape>
+            </w:pict>
+          </mc:Fallback>
+        </mc:AlternateContent>
+      </w:r>
+      <w:r>
+        <w:rPr>
+          <w:sz w:val="24"/>
+          <w:szCs w:val="24"/>
+        </w:rPr>
+        <w:drawing>
+          <wp:inline distT="0" distB="0" distL="0" distR="0" wp14:anchorId="35EE393A" wp14:editId="0F16252A">
+            <wp:extent cx="5400040" cy="1489075"/>
+            <wp:effectExtent l="0" t="0" r="0" b="0"/>
+            <wp:docPr id="139" name="Imagem 139"/>
+            <wp:cNvGraphicFramePr>
+              <a:graphicFrameLocks xmlns:a="http://schemas.openxmlformats.org/drawingml/2006/main" noChangeAspect="1"/>
+            </wp:cNvGraphicFramePr>
+            <a:graphic xmlns:a="http://schemas.openxmlformats.org/drawingml/2006/main">
+              <a:graphicData uri="http://schemas.openxmlformats.org/drawingml/2006/picture">
+                <pic:pic xmlns:pic="http://schemas.openxmlformats.org/drawingml/2006/picture">
+                  <pic:nvPicPr>
+                    <pic:cNvPr id="1" name=""/>
+                    <pic:cNvPicPr/>
+                  </pic:nvPicPr>
+                  <pic:blipFill>
+                    <a:blip r:embed="rId113"/>
+                    <a:stretch>
+                      <a:fillRect/>
+                    </a:stretch>
+                  </pic:blipFill>
+                  <pic:spPr>
+                    <a:xfrm>
+                      <a:off x="0" y="0"/>
+                      <a:ext cx="5400040" cy="1489075"/>
+                    </a:xfrm>
+                    <a:prstGeom prst="rect">
+                      <a:avLst/>
+                    </a:prstGeom>
+                  </pic:spPr>
+                </pic:pic>
+              </a:graphicData>
+            </a:graphic>
+          </wp:inline>
+        </w:drawing>
+      </w:r>
+    </w:p>
+    <w:p>
+      <w:pPr>
+        <w:pStyle w:val="PargrafodaLista"/>
+        <w:tabs>
+          <w:tab w:val="left" w:pos="1275"/>
+        </w:tabs>
+        <w:rPr>
+          <w:sz w:val="24"/>
+          <w:szCs w:val="24"/>
+        </w:rPr>
+      </w:pPr>
       <w:bookmarkStart w:id="0" w:name="_GoBack"/>
+      <w:r>
+        <w:rPr>
+          <w:sz w:val="24"/>
+          <w:szCs w:val="24"/>
+        </w:rPr>
+        <w:drawing>
+          <wp:inline distT="0" distB="0" distL="0" distR="0" wp14:anchorId="4DB34B6C" wp14:editId="72615CD3">
+            <wp:extent cx="5210902" cy="1152686"/>
+            <wp:effectExtent l="0" t="0" r="0" b="9525"/>
+            <wp:docPr id="141" name="Imagem 141"/>
+            <wp:cNvGraphicFramePr>
+              <a:graphicFrameLocks xmlns:a="http://schemas.openxmlformats.org/drawingml/2006/main" noChangeAspect="1"/>
+            </wp:cNvGraphicFramePr>
+            <a:graphic xmlns:a="http://schemas.openxmlformats.org/drawingml/2006/main">
+              <a:graphicData uri="http://schemas.openxmlformats.org/drawingml/2006/picture">
+                <pic:pic xmlns:pic="http://schemas.openxmlformats.org/drawingml/2006/picture">
+                  <pic:nvPicPr>
+                    <pic:cNvPr id="1" name=""/>
+                    <pic:cNvPicPr/>
+                  </pic:nvPicPr>
+                  <pic:blipFill>
+                    <a:blip r:embed="rId114"/>
+                    <a:stretch>
+                      <a:fillRect/>
+                    </a:stretch>
+                  </pic:blipFill>
+                  <pic:spPr>
+                    <a:xfrm>
+                      <a:off x="0" y="0"/>
+                      <a:ext cx="5210902" cy="1152686"/>
+                    </a:xfrm>
+                    <a:prstGeom prst="rect">
+                      <a:avLst/>
+                    </a:prstGeom>
+                  </pic:spPr>
+                </pic:pic>
+              </a:graphicData>
+            </a:graphic>
+          </wp:inline>
+        </w:drawing>
+      </w:r>
       <w:bookmarkEnd w:id="0"/>
+    </w:p>
+    <w:p>
+      <w:pPr>
+        <w:pStyle w:val="PargrafodaLista"/>
+        <w:tabs>
+          <w:tab w:val="left" w:pos="1275"/>
+        </w:tabs>
+        <w:rPr>
+          <w:sz w:val="24"/>
+          <w:szCs w:val="24"/>
+        </w:rPr>
+      </w:pPr>
+    </w:p>
+    <w:p>
+      <w:pPr>
+        <w:pStyle w:val="PargrafodaLista"/>
+        <w:tabs>
+          <w:tab w:val="left" w:pos="1275"/>
+        </w:tabs>
+        <w:rPr>
+          <w:sz w:val="24"/>
+          <w:szCs w:val="24"/>
+        </w:rPr>
+      </w:pPr>
+    </w:p>
+    <w:p>
+      <w:pPr>
+        <w:pStyle w:val="PargrafodaLista"/>
+        <w:tabs>
+          <w:tab w:val="left" w:pos="1275"/>
+        </w:tabs>
+        <w:rPr>
+          <w:sz w:val="24"/>
+          <w:szCs w:val="24"/>
+        </w:rPr>
+      </w:pPr>
+    </w:p>
+    <w:p>
+      <w:pPr>
+        <w:pStyle w:val="PargrafodaLista"/>
+        <w:tabs>
+          <w:tab w:val="left" w:pos="1275"/>
+        </w:tabs>
+        <w:rPr>
+          <w:sz w:val="24"/>
+          <w:szCs w:val="24"/>
+        </w:rPr>
+      </w:pPr>
     </w:p>
     <w:p>
       <w:pPr>
@@ -16028,7 +17173,7 @@
 </file>
 
 <file path=customXml/itemProps1.xml><?xml version="1.0" encoding="utf-8"?>
-<ds:datastoreItem xmlns:ds="http://schemas.openxmlformats.org/officeDocument/2006/customXml" ds:itemID="{7DDB40CD-73D9-4280-A234-ADC0A15691D6}">
+<ds:datastoreItem xmlns:ds="http://schemas.openxmlformats.org/officeDocument/2006/customXml" ds:itemID="{3E60E94C-D4A8-47CE-9611-464D2EC5D635}">
   <ds:schemaRefs>
     <ds:schemaRef ds:uri="http://schemas.openxmlformats.org/officeDocument/2006/bibliography"/>
   </ds:schemaRefs>

</xml_diff>

<commit_message>
atualização da aula dia 05/10/2026
</commit_message>
<xml_diff>
--- a/apostila/Apostila Space For Men.docx
+++ b/apostila/Apostila Space For Men.docx
@@ -14874,6 +14874,7 @@
       </w:r>
       <w:r>
         <w:rPr>
+          <w:noProof/>
           <w:sz w:val="24"/>
           <w:szCs w:val="24"/>
         </w:rPr>
@@ -14927,6 +14928,7 @@
       </w:pPr>
       <w:r>
         <w:rPr>
+          <w:noProof/>
           <w:sz w:val="24"/>
           <w:szCs w:val="24"/>
         </w:rPr>
@@ -15252,6 +15254,7 @@
       </w:r>
       <w:r>
         <w:rPr>
+          <w:noProof/>
           <w:sz w:val="24"/>
           <w:szCs w:val="24"/>
         </w:rPr>
@@ -15672,6 +15675,7 @@
       </w:r>
       <w:r>
         <w:rPr>
+          <w:noProof/>
           <w:sz w:val="24"/>
           <w:szCs w:val="24"/>
         </w:rPr>
@@ -15723,9 +15727,9 @@
           <w:szCs w:val="24"/>
         </w:rPr>
       </w:pPr>
-      <w:bookmarkStart w:id="0" w:name="_GoBack"/>
-      <w:r>
-        <w:rPr>
+      <w:r>
+        <w:rPr>
+          <w:noProof/>
           <w:sz w:val="24"/>
           <w:szCs w:val="24"/>
         </w:rPr>
@@ -15765,67 +15769,1566 @@
           </wp:inline>
         </w:drawing>
       </w:r>
+    </w:p>
+    <w:p>
+      <w:pPr>
+        <w:pStyle w:val="PargrafodaLista"/>
+        <w:tabs>
+          <w:tab w:val="left" w:pos="1275"/>
+        </w:tabs>
+        <w:rPr>
+          <w:sz w:val="24"/>
+          <w:szCs w:val="24"/>
+        </w:rPr>
+      </w:pPr>
+    </w:p>
+    <w:p>
+      <w:pPr>
+        <w:pStyle w:val="PargrafodaLista"/>
+        <w:tabs>
+          <w:tab w:val="left" w:pos="1275"/>
+        </w:tabs>
+        <w:rPr>
+          <w:sz w:val="24"/>
+          <w:szCs w:val="24"/>
+        </w:rPr>
+      </w:pPr>
+    </w:p>
+    <w:p>
+      <w:pPr>
+        <w:pStyle w:val="PargrafodaLista"/>
+        <w:tabs>
+          <w:tab w:val="left" w:pos="1275"/>
+        </w:tabs>
+        <w:rPr>
+          <w:sz w:val="24"/>
+          <w:szCs w:val="24"/>
+        </w:rPr>
+      </w:pPr>
+    </w:p>
+    <w:p>
+      <w:pPr>
+        <w:pStyle w:val="PargrafodaLista"/>
+        <w:tabs>
+          <w:tab w:val="left" w:pos="1275"/>
+        </w:tabs>
+        <w:rPr>
+          <w:sz w:val="24"/>
+          <w:szCs w:val="24"/>
+        </w:rPr>
+      </w:pPr>
+    </w:p>
+    <w:p>
+      <w:pPr>
+        <w:pStyle w:val="PargrafodaLista"/>
+        <w:tabs>
+          <w:tab w:val="left" w:pos="1275"/>
+        </w:tabs>
+        <w:rPr>
+          <w:sz w:val="24"/>
+          <w:szCs w:val="24"/>
+        </w:rPr>
+      </w:pPr>
+    </w:p>
+    <w:p>
+      <w:pPr>
+        <w:pStyle w:val="PargrafodaLista"/>
+        <w:tabs>
+          <w:tab w:val="left" w:pos="1275"/>
+        </w:tabs>
+        <w:rPr>
+          <w:sz w:val="24"/>
+          <w:szCs w:val="24"/>
+        </w:rPr>
+      </w:pPr>
+      <w:r>
+        <w:rPr>
+          <w:sz w:val="24"/>
+          <w:szCs w:val="24"/>
+        </w:rPr>
+        <w:lastRenderedPageBreak/>
+        <w:t xml:space="preserve">74 – Para adicionar o mapa vamos ao </w:t>
+      </w:r>
+      <w:proofErr w:type="spellStart"/>
+      <w:r>
+        <w:rPr>
+          <w:sz w:val="24"/>
+          <w:szCs w:val="24"/>
+        </w:rPr>
+        <w:t>google</w:t>
+      </w:r>
+      <w:proofErr w:type="spellEnd"/>
+      <w:r>
+        <w:rPr>
+          <w:sz w:val="24"/>
+          <w:szCs w:val="24"/>
+        </w:rPr>
+        <w:t xml:space="preserve"> </w:t>
+      </w:r>
+      <w:proofErr w:type="spellStart"/>
+      <w:r>
+        <w:rPr>
+          <w:sz w:val="24"/>
+          <w:szCs w:val="24"/>
+        </w:rPr>
+        <w:t>maps</w:t>
+      </w:r>
+      <w:proofErr w:type="spellEnd"/>
+      <w:r>
+        <w:rPr>
+          <w:sz w:val="24"/>
+          <w:szCs w:val="24"/>
+        </w:rPr>
+        <w:t>(</w:t>
+      </w:r>
+      <w:r>
+        <w:rPr>
+          <w:sz w:val="24"/>
+          <w:szCs w:val="24"/>
+        </w:rPr>
+        <w:t xml:space="preserve"> </w:t>
+      </w:r>
+      <w:hyperlink r:id="rId115" w:history="1">
+        <w:r>
+          <w:rPr>
+            <w:rStyle w:val="Hyperlink"/>
+            <w:sz w:val="24"/>
+            <w:szCs w:val="24"/>
+          </w:rPr>
+          <w:t>https://www.google.com/maps</w:t>
+        </w:r>
+      </w:hyperlink>
+      <w:r>
+        <w:rPr>
+          <w:sz w:val="24"/>
+          <w:szCs w:val="24"/>
+        </w:rPr>
+        <w:t xml:space="preserve"> </w:t>
+      </w:r>
+      <w:r>
+        <w:rPr>
+          <w:sz w:val="24"/>
+          <w:szCs w:val="24"/>
+        </w:rPr>
+        <w:t>)</w:t>
+      </w:r>
+      <w:r>
+        <w:rPr>
+          <w:sz w:val="24"/>
+          <w:szCs w:val="24"/>
+        </w:rPr>
+        <w:t xml:space="preserve"> </w:t>
+      </w:r>
+      <w:r>
+        <w:rPr>
+          <w:sz w:val="24"/>
+          <w:szCs w:val="24"/>
+        </w:rPr>
+        <w:t>e digitamos o</w:t>
+      </w:r>
+      <w:r>
+        <w:rPr>
+          <w:sz w:val="24"/>
+          <w:szCs w:val="24"/>
+        </w:rPr>
+        <w:t xml:space="preserve"> </w:t>
+      </w:r>
+      <w:r>
+        <w:rPr>
+          <w:sz w:val="24"/>
+          <w:szCs w:val="24"/>
+        </w:rPr>
+        <w:t>nome desejado na pesquisa.</w:t>
+      </w:r>
+    </w:p>
+    <w:p>
+      <w:pPr>
+        <w:pStyle w:val="PargrafodaLista"/>
+        <w:tabs>
+          <w:tab w:val="left" w:pos="1275"/>
+        </w:tabs>
+        <w:rPr>
+          <w:sz w:val="24"/>
+          <w:szCs w:val="24"/>
+        </w:rPr>
+      </w:pPr>
+      <w:r>
+        <w:rPr>
+          <w:sz w:val="24"/>
+          <w:szCs w:val="24"/>
+        </w:rPr>
+        <w:drawing>
+          <wp:inline distT="0" distB="0" distL="0" distR="0" wp14:anchorId="1653F049" wp14:editId="49DB2A8E">
+            <wp:extent cx="5400040" cy="4822190"/>
+            <wp:effectExtent l="0" t="0" r="0" b="0"/>
+            <wp:docPr id="136" name="Imagem 136"/>
+            <wp:cNvGraphicFramePr>
+              <a:graphicFrameLocks xmlns:a="http://schemas.openxmlformats.org/drawingml/2006/main" noChangeAspect="1"/>
+            </wp:cNvGraphicFramePr>
+            <a:graphic xmlns:a="http://schemas.openxmlformats.org/drawingml/2006/main">
+              <a:graphicData uri="http://schemas.openxmlformats.org/drawingml/2006/picture">
+                <pic:pic xmlns:pic="http://schemas.openxmlformats.org/drawingml/2006/picture">
+                  <pic:nvPicPr>
+                    <pic:cNvPr id="1" name=""/>
+                    <pic:cNvPicPr/>
+                  </pic:nvPicPr>
+                  <pic:blipFill>
+                    <a:blip r:embed="rId116"/>
+                    <a:stretch>
+                      <a:fillRect/>
+                    </a:stretch>
+                  </pic:blipFill>
+                  <pic:spPr>
+                    <a:xfrm>
+                      <a:off x="0" y="0"/>
+                      <a:ext cx="5400040" cy="4822190"/>
+                    </a:xfrm>
+                    <a:prstGeom prst="rect">
+                      <a:avLst/>
+                    </a:prstGeom>
+                  </pic:spPr>
+                </pic:pic>
+              </a:graphicData>
+            </a:graphic>
+          </wp:inline>
+        </w:drawing>
+      </w:r>
+    </w:p>
+    <w:p>
+      <w:pPr>
+        <w:pStyle w:val="PargrafodaLista"/>
+        <w:tabs>
+          <w:tab w:val="left" w:pos="1275"/>
+        </w:tabs>
+        <w:rPr>
+          <w:sz w:val="24"/>
+          <w:szCs w:val="24"/>
+        </w:rPr>
+      </w:pPr>
+    </w:p>
+    <w:p>
+      <w:pPr>
+        <w:pStyle w:val="PargrafodaLista"/>
+        <w:tabs>
+          <w:tab w:val="left" w:pos="1275"/>
+        </w:tabs>
+        <w:rPr>
+          <w:sz w:val="24"/>
+          <w:szCs w:val="24"/>
+        </w:rPr>
+      </w:pPr>
+    </w:p>
+    <w:p>
+      <w:pPr>
+        <w:pStyle w:val="PargrafodaLista"/>
+        <w:tabs>
+          <w:tab w:val="left" w:pos="1275"/>
+        </w:tabs>
+        <w:rPr>
+          <w:sz w:val="24"/>
+          <w:szCs w:val="24"/>
+        </w:rPr>
+      </w:pPr>
+    </w:p>
+    <w:p>
+      <w:pPr>
+        <w:pStyle w:val="PargrafodaLista"/>
+        <w:tabs>
+          <w:tab w:val="left" w:pos="1275"/>
+        </w:tabs>
+        <w:rPr>
+          <w:sz w:val="24"/>
+          <w:szCs w:val="24"/>
+        </w:rPr>
+      </w:pPr>
+    </w:p>
+    <w:p>
+      <w:pPr>
+        <w:pStyle w:val="PargrafodaLista"/>
+        <w:tabs>
+          <w:tab w:val="left" w:pos="1275"/>
+        </w:tabs>
+        <w:rPr>
+          <w:sz w:val="24"/>
+          <w:szCs w:val="24"/>
+        </w:rPr>
+      </w:pPr>
+    </w:p>
+    <w:p>
+      <w:pPr>
+        <w:pStyle w:val="PargrafodaLista"/>
+        <w:tabs>
+          <w:tab w:val="left" w:pos="1275"/>
+        </w:tabs>
+        <w:rPr>
+          <w:sz w:val="24"/>
+          <w:szCs w:val="24"/>
+        </w:rPr>
+      </w:pPr>
+    </w:p>
+    <w:p>
+      <w:pPr>
+        <w:pStyle w:val="PargrafodaLista"/>
+        <w:tabs>
+          <w:tab w:val="left" w:pos="1275"/>
+        </w:tabs>
+        <w:rPr>
+          <w:sz w:val="24"/>
+          <w:szCs w:val="24"/>
+        </w:rPr>
+      </w:pPr>
+    </w:p>
+    <w:p>
+      <w:pPr>
+        <w:pStyle w:val="PargrafodaLista"/>
+        <w:tabs>
+          <w:tab w:val="left" w:pos="1275"/>
+        </w:tabs>
+        <w:rPr>
+          <w:sz w:val="24"/>
+          <w:szCs w:val="24"/>
+        </w:rPr>
+      </w:pPr>
+    </w:p>
+    <w:p>
+      <w:pPr>
+        <w:pStyle w:val="PargrafodaLista"/>
+        <w:tabs>
+          <w:tab w:val="left" w:pos="1275"/>
+        </w:tabs>
+        <w:rPr>
+          <w:sz w:val="24"/>
+          <w:szCs w:val="24"/>
+        </w:rPr>
+      </w:pPr>
+    </w:p>
+    <w:p>
+      <w:pPr>
+        <w:pStyle w:val="PargrafodaLista"/>
+        <w:tabs>
+          <w:tab w:val="left" w:pos="1275"/>
+        </w:tabs>
+        <w:rPr>
+          <w:sz w:val="24"/>
+          <w:szCs w:val="24"/>
+        </w:rPr>
+      </w:pPr>
+    </w:p>
+    <w:p>
+      <w:pPr>
+        <w:pStyle w:val="PargrafodaLista"/>
+        <w:tabs>
+          <w:tab w:val="left" w:pos="1275"/>
+        </w:tabs>
+        <w:rPr>
+          <w:sz w:val="24"/>
+          <w:szCs w:val="24"/>
+        </w:rPr>
+      </w:pPr>
+    </w:p>
+    <w:p>
+      <w:pPr>
+        <w:pStyle w:val="PargrafodaLista"/>
+        <w:tabs>
+          <w:tab w:val="left" w:pos="1275"/>
+        </w:tabs>
+        <w:rPr>
+          <w:sz w:val="24"/>
+          <w:szCs w:val="24"/>
+        </w:rPr>
+      </w:pPr>
+    </w:p>
+    <w:p>
+      <w:pPr>
+        <w:pStyle w:val="PargrafodaLista"/>
+        <w:tabs>
+          <w:tab w:val="left" w:pos="1275"/>
+        </w:tabs>
+        <w:rPr>
+          <w:sz w:val="24"/>
+          <w:szCs w:val="24"/>
+        </w:rPr>
+      </w:pPr>
+    </w:p>
+    <w:p>
+      <w:pPr>
+        <w:pStyle w:val="PargrafodaLista"/>
+        <w:tabs>
+          <w:tab w:val="left" w:pos="1275"/>
+        </w:tabs>
+        <w:rPr>
+          <w:sz w:val="24"/>
+          <w:szCs w:val="24"/>
+        </w:rPr>
+      </w:pPr>
+    </w:p>
+    <w:p>
+      <w:pPr>
+        <w:pStyle w:val="PargrafodaLista"/>
+        <w:tabs>
+          <w:tab w:val="left" w:pos="1275"/>
+        </w:tabs>
+        <w:rPr>
+          <w:sz w:val="24"/>
+          <w:szCs w:val="24"/>
+        </w:rPr>
+      </w:pPr>
+    </w:p>
+    <w:p>
+      <w:pPr>
+        <w:pStyle w:val="PargrafodaLista"/>
+        <w:tabs>
+          <w:tab w:val="left" w:pos="1275"/>
+        </w:tabs>
+        <w:rPr>
+          <w:sz w:val="24"/>
+          <w:szCs w:val="24"/>
+        </w:rPr>
+      </w:pPr>
+    </w:p>
+    <w:p>
+      <w:pPr>
+        <w:pStyle w:val="PargrafodaLista"/>
+        <w:tabs>
+          <w:tab w:val="left" w:pos="1275"/>
+        </w:tabs>
+        <w:rPr>
+          <w:sz w:val="24"/>
+          <w:szCs w:val="24"/>
+        </w:rPr>
+      </w:pPr>
+    </w:p>
+    <w:p>
+      <w:pPr>
+        <w:pStyle w:val="PargrafodaLista"/>
+        <w:tabs>
+          <w:tab w:val="left" w:pos="1275"/>
+        </w:tabs>
+        <w:rPr>
+          <w:sz w:val="24"/>
+          <w:szCs w:val="24"/>
+        </w:rPr>
+      </w:pPr>
+    </w:p>
+    <w:p>
+      <w:pPr>
+        <w:pStyle w:val="PargrafodaLista"/>
+        <w:tabs>
+          <w:tab w:val="left" w:pos="1275"/>
+        </w:tabs>
+        <w:rPr>
+          <w:sz w:val="24"/>
+          <w:szCs w:val="24"/>
+        </w:rPr>
+      </w:pPr>
+    </w:p>
+    <w:p>
+      <w:pPr>
+        <w:pStyle w:val="PargrafodaLista"/>
+        <w:tabs>
+          <w:tab w:val="left" w:pos="1275"/>
+        </w:tabs>
+        <w:rPr>
+          <w:sz w:val="24"/>
+          <w:szCs w:val="24"/>
+        </w:rPr>
+      </w:pPr>
+      <w:r>
+        <w:rPr>
+          <w:sz w:val="24"/>
+          <w:szCs w:val="24"/>
+        </w:rPr>
+        <w:t xml:space="preserve">75 </w:t>
+      </w:r>
+      <w:r>
+        <w:rPr>
+          <w:sz w:val="24"/>
+          <w:szCs w:val="24"/>
+        </w:rPr>
+        <w:t>–</w:t>
+      </w:r>
+      <w:r>
+        <w:rPr>
+          <w:sz w:val="24"/>
+          <w:szCs w:val="24"/>
+        </w:rPr>
+        <w:t xml:space="preserve"> </w:t>
+      </w:r>
+      <w:r>
+        <w:rPr>
+          <w:sz w:val="24"/>
+          <w:szCs w:val="24"/>
+        </w:rPr>
+        <w:t xml:space="preserve">No campo parecido com 3 pontinho ou </w:t>
+      </w:r>
+      <w:r>
+        <w:rPr>
+          <w:sz w:val="24"/>
+          <w:szCs w:val="24"/>
+        </w:rPr>
+        <w:t>três linhas</w:t>
+      </w:r>
+      <w:r>
+        <w:rPr>
+          <w:sz w:val="24"/>
+          <w:szCs w:val="24"/>
+        </w:rPr>
+        <w:t xml:space="preserve"> clicar</w:t>
+      </w:r>
+    </w:p>
+    <w:p>
+      <w:pPr>
+        <w:pStyle w:val="PargrafodaLista"/>
+        <w:tabs>
+          <w:tab w:val="left" w:pos="1275"/>
+        </w:tabs>
+        <w:rPr>
+          <w:sz w:val="24"/>
+          <w:szCs w:val="24"/>
+        </w:rPr>
+      </w:pPr>
+      <w:r>
+        <w:rPr>
+          <w:noProof/>
+          <w:sz w:val="24"/>
+          <w:szCs w:val="24"/>
+        </w:rPr>
+        <mc:AlternateContent>
+          <mc:Choice Requires="wps">
+            <w:drawing>
+              <wp:anchor distT="0" distB="0" distL="114300" distR="114300" simplePos="0" relativeHeight="251695104" behindDoc="0" locked="0" layoutInCell="1" allowOverlap="1">
+                <wp:simplePos x="0" y="0"/>
+                <wp:positionH relativeFrom="column">
+                  <wp:posOffset>1193938</wp:posOffset>
+                </wp:positionH>
+                <wp:positionV relativeFrom="paragraph">
+                  <wp:posOffset>34704</wp:posOffset>
+                </wp:positionV>
+                <wp:extent cx="2226365" cy="548640"/>
+                <wp:effectExtent l="38100" t="0" r="21590" b="80010"/>
+                <wp:wrapNone/>
+                <wp:docPr id="143" name="Conector de Seta Reta 143"/>
+                <wp:cNvGraphicFramePr/>
+                <a:graphic xmlns:a="http://schemas.openxmlformats.org/drawingml/2006/main">
+                  <a:graphicData uri="http://schemas.microsoft.com/office/word/2010/wordprocessingShape">
+                    <wps:wsp>
+                      <wps:cNvCnPr/>
+                      <wps:spPr>
+                        <a:xfrm flipH="1">
+                          <a:off x="0" y="0"/>
+                          <a:ext cx="2226365" cy="548640"/>
+                        </a:xfrm>
+                        <a:prstGeom prst="straightConnector1">
+                          <a:avLst/>
+                        </a:prstGeom>
+                        <a:ln>
+                          <a:tailEnd type="triangle"/>
+                        </a:ln>
+                      </wps:spPr>
+                      <wps:style>
+                        <a:lnRef idx="1">
+                          <a:schemeClr val="accent1"/>
+                        </a:lnRef>
+                        <a:fillRef idx="0">
+                          <a:schemeClr val="accent1"/>
+                        </a:fillRef>
+                        <a:effectRef idx="0">
+                          <a:schemeClr val="accent1"/>
+                        </a:effectRef>
+                        <a:fontRef idx="minor">
+                          <a:schemeClr val="tx1"/>
+                        </a:fontRef>
+                      </wps:style>
+                      <wps:bodyPr/>
+                    </wps:wsp>
+                  </a:graphicData>
+                </a:graphic>
+              </wp:anchor>
+            </w:drawing>
+          </mc:Choice>
+          <mc:Fallback>
+            <w:pict>
+              <v:shapetype w14:anchorId="1E2DF011" id="_x0000_t32" coordsize="21600,21600" o:spt="32" o:oned="t" path="m,l21600,21600e" filled="f">
+                <v:path arrowok="t" fillok="f" o:connecttype="none"/>
+                <o:lock v:ext="edit" shapetype="t"/>
+              </v:shapetype>
+              <v:shape id="Conector de Seta Reta 143" o:spid="_x0000_s1026" type="#_x0000_t32" style="position:absolute;margin-left:94pt;margin-top:2.75pt;width:175.3pt;height:43.2pt;flip:x;z-index:251695104;visibility:visible;mso-wrap-style:square;mso-wrap-distance-left:9pt;mso-wrap-distance-top:0;mso-wrap-distance-right:9pt;mso-wrap-distance-bottom:0;mso-position-horizontal:absolute;mso-position-horizontal-relative:text;mso-position-vertical:absolute;mso-position-vertical-relative:text" o:gfxdata="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" strokecolor="#4472c4 [3204]" strokeweight=".5pt">
+                <v:stroke endarrow="block" joinstyle="miter"/>
+              </v:shape>
+            </w:pict>
+          </mc:Fallback>
+        </mc:AlternateContent>
+      </w:r>
+    </w:p>
+    <w:p>
+      <w:pPr>
+        <w:pStyle w:val="PargrafodaLista"/>
+        <w:tabs>
+          <w:tab w:val="left" w:pos="1275"/>
+        </w:tabs>
+        <w:rPr>
+          <w:sz w:val="24"/>
+          <w:szCs w:val="24"/>
+        </w:rPr>
+      </w:pPr>
+      <w:r>
+        <w:rPr>
+          <w:sz w:val="24"/>
+          <w:szCs w:val="24"/>
+        </w:rPr>
+        <w:drawing>
+          <wp:inline distT="0" distB="0" distL="0" distR="0" wp14:anchorId="185A30F8" wp14:editId="30E5731A">
+            <wp:extent cx="5400040" cy="3325495"/>
+            <wp:effectExtent l="0" t="0" r="0" b="8255"/>
+            <wp:docPr id="142" name="Imagem 142"/>
+            <wp:cNvGraphicFramePr>
+              <a:graphicFrameLocks xmlns:a="http://schemas.openxmlformats.org/drawingml/2006/main" noChangeAspect="1"/>
+            </wp:cNvGraphicFramePr>
+            <a:graphic xmlns:a="http://schemas.openxmlformats.org/drawingml/2006/main">
+              <a:graphicData uri="http://schemas.openxmlformats.org/drawingml/2006/picture">
+                <pic:pic xmlns:pic="http://schemas.openxmlformats.org/drawingml/2006/picture">
+                  <pic:nvPicPr>
+                    <pic:cNvPr id="1" name=""/>
+                    <pic:cNvPicPr/>
+                  </pic:nvPicPr>
+                  <pic:blipFill>
+                    <a:blip r:embed="rId117"/>
+                    <a:stretch>
+                      <a:fillRect/>
+                    </a:stretch>
+                  </pic:blipFill>
+                  <pic:spPr>
+                    <a:xfrm>
+                      <a:off x="0" y="0"/>
+                      <a:ext cx="5400040" cy="3325495"/>
+                    </a:xfrm>
+                    <a:prstGeom prst="rect">
+                      <a:avLst/>
+                    </a:prstGeom>
+                  </pic:spPr>
+                </pic:pic>
+              </a:graphicData>
+            </a:graphic>
+          </wp:inline>
+        </w:drawing>
+      </w:r>
+    </w:p>
+    <w:p>
+      <w:pPr>
+        <w:pStyle w:val="PargrafodaLista"/>
+        <w:tabs>
+          <w:tab w:val="left" w:pos="1275"/>
+        </w:tabs>
+        <w:rPr>
+          <w:sz w:val="24"/>
+          <w:szCs w:val="24"/>
+        </w:rPr>
+      </w:pPr>
+    </w:p>
+    <w:p>
+      <w:pPr>
+        <w:pStyle w:val="PargrafodaLista"/>
+        <w:tabs>
+          <w:tab w:val="left" w:pos="1275"/>
+        </w:tabs>
+        <w:rPr>
+          <w:sz w:val="24"/>
+          <w:szCs w:val="24"/>
+        </w:rPr>
+      </w:pPr>
+      <w:r>
+        <w:rPr>
+          <w:sz w:val="24"/>
+          <w:szCs w:val="24"/>
+        </w:rPr>
+        <w:t xml:space="preserve">76- Vai aparecer a seguinte tela no campo compartilhar ou incorporar </w:t>
+      </w:r>
+      <w:r>
+        <w:rPr>
+          <w:sz w:val="24"/>
+          <w:szCs w:val="24"/>
+        </w:rPr>
+        <w:t>ma</w:t>
+      </w:r>
+      <w:r>
+        <w:rPr>
+          <w:sz w:val="24"/>
+          <w:szCs w:val="24"/>
+        </w:rPr>
+        <w:t>pa</w:t>
+      </w:r>
+    </w:p>
+    <w:p>
+      <w:pPr>
+        <w:pStyle w:val="PargrafodaLista"/>
+        <w:tabs>
+          <w:tab w:val="left" w:pos="1275"/>
+        </w:tabs>
+        <w:rPr>
+          <w:sz w:val="24"/>
+          <w:szCs w:val="24"/>
+        </w:rPr>
+      </w:pPr>
+      <w:r>
+        <w:rPr>
+          <w:noProof/>
+          <w:sz w:val="24"/>
+          <w:szCs w:val="24"/>
+        </w:rPr>
+        <mc:AlternateContent>
+          <mc:Choice Requires="wps">
+            <w:drawing>
+              <wp:anchor distT="0" distB="0" distL="114300" distR="114300" simplePos="0" relativeHeight="251697152" behindDoc="0" locked="0" layoutInCell="1" allowOverlap="1">
+                <wp:simplePos x="0" y="0"/>
+                <wp:positionH relativeFrom="column">
+                  <wp:posOffset>2504313</wp:posOffset>
+                </wp:positionH>
+                <wp:positionV relativeFrom="paragraph">
+                  <wp:posOffset>2531288</wp:posOffset>
+                </wp:positionV>
+                <wp:extent cx="1938528" cy="51206"/>
+                <wp:effectExtent l="0" t="19050" r="100330" b="101600"/>
+                <wp:wrapNone/>
+                <wp:docPr id="149" name="Conector de Seta Reta 149"/>
+                <wp:cNvGraphicFramePr/>
+                <a:graphic xmlns:a="http://schemas.openxmlformats.org/drawingml/2006/main">
+                  <a:graphicData uri="http://schemas.microsoft.com/office/word/2010/wordprocessingShape">
+                    <wps:wsp>
+                      <wps:cNvCnPr/>
+                      <wps:spPr>
+                        <a:xfrm>
+                          <a:off x="0" y="0"/>
+                          <a:ext cx="1938528" cy="51206"/>
+                        </a:xfrm>
+                        <a:prstGeom prst="straightConnector1">
+                          <a:avLst/>
+                        </a:prstGeom>
+                        <a:ln>
+                          <a:tailEnd type="triangle"/>
+                        </a:ln>
+                      </wps:spPr>
+                      <wps:style>
+                        <a:lnRef idx="1">
+                          <a:schemeClr val="accent1"/>
+                        </a:lnRef>
+                        <a:fillRef idx="0">
+                          <a:schemeClr val="accent1"/>
+                        </a:fillRef>
+                        <a:effectRef idx="0">
+                          <a:schemeClr val="accent1"/>
+                        </a:effectRef>
+                        <a:fontRef idx="minor">
+                          <a:schemeClr val="tx1"/>
+                        </a:fontRef>
+                      </wps:style>
+                      <wps:bodyPr/>
+                    </wps:wsp>
+                  </a:graphicData>
+                </a:graphic>
+              </wp:anchor>
+            </w:drawing>
+          </mc:Choice>
+          <mc:Fallback>
+            <w:pict>
+              <v:shape w14:anchorId="557110D9" id="Conector de Seta Reta 149" o:spid="_x0000_s1026" type="#_x0000_t32" style="position:absolute;margin-left:197.2pt;margin-top:199.3pt;width:152.65pt;height:4.05pt;z-index:251697152;visibility:visible;mso-wrap-style:square;mso-wrap-distance-left:9pt;mso-wrap-distance-top:0;mso-wrap-distance-right:9pt;mso-wrap-distance-bottom:0;mso-position-horizontal:absolute;mso-position-horizontal-relative:text;mso-position-vertical:absolute;mso-position-vertical-relative:text" o:gfxdata="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" strokecolor="#4472c4 [3204]" strokeweight=".5pt">
+                <v:stroke endarrow="block" joinstyle="miter"/>
+              </v:shape>
+            </w:pict>
+          </mc:Fallback>
+        </mc:AlternateContent>
+      </w:r>
+      <w:r>
+        <w:rPr>
+          <w:noProof/>
+          <w:sz w:val="24"/>
+          <w:szCs w:val="24"/>
+        </w:rPr>
+        <mc:AlternateContent>
+          <mc:Choice Requires="wps">
+            <w:drawing>
+              <wp:anchor distT="0" distB="0" distL="114300" distR="114300" simplePos="0" relativeHeight="251696128" behindDoc="0" locked="0" layoutInCell="1" allowOverlap="1">
+                <wp:simplePos x="0" y="0"/>
+                <wp:positionH relativeFrom="column">
+                  <wp:posOffset>2365324</wp:posOffset>
+                </wp:positionH>
+                <wp:positionV relativeFrom="paragraph">
+                  <wp:posOffset>7544</wp:posOffset>
+                </wp:positionV>
+                <wp:extent cx="1704442" cy="2413660"/>
+                <wp:effectExtent l="38100" t="0" r="29210" b="62865"/>
+                <wp:wrapNone/>
+                <wp:docPr id="146" name="Conector de Seta Reta 146"/>
+                <wp:cNvGraphicFramePr/>
+                <a:graphic xmlns:a="http://schemas.openxmlformats.org/drawingml/2006/main">
+                  <a:graphicData uri="http://schemas.microsoft.com/office/word/2010/wordprocessingShape">
+                    <wps:wsp>
+                      <wps:cNvCnPr/>
+                      <wps:spPr>
+                        <a:xfrm flipH="1">
+                          <a:off x="0" y="0"/>
+                          <a:ext cx="1704442" cy="2413660"/>
+                        </a:xfrm>
+                        <a:prstGeom prst="straightConnector1">
+                          <a:avLst/>
+                        </a:prstGeom>
+                        <a:ln>
+                          <a:tailEnd type="triangle"/>
+                        </a:ln>
+                      </wps:spPr>
+                      <wps:style>
+                        <a:lnRef idx="1">
+                          <a:schemeClr val="accent1"/>
+                        </a:lnRef>
+                        <a:fillRef idx="0">
+                          <a:schemeClr val="accent1"/>
+                        </a:fillRef>
+                        <a:effectRef idx="0">
+                          <a:schemeClr val="accent1"/>
+                        </a:effectRef>
+                        <a:fontRef idx="minor">
+                          <a:schemeClr val="tx1"/>
+                        </a:fontRef>
+                      </wps:style>
+                      <wps:bodyPr/>
+                    </wps:wsp>
+                  </a:graphicData>
+                </a:graphic>
+                <wp14:sizeRelH relativeFrom="margin">
+                  <wp14:pctWidth>0</wp14:pctWidth>
+                </wp14:sizeRelH>
+                <wp14:sizeRelV relativeFrom="margin">
+                  <wp14:pctHeight>0</wp14:pctHeight>
+                </wp14:sizeRelV>
+              </wp:anchor>
+            </w:drawing>
+          </mc:Choice>
+          <mc:Fallback>
+            <w:pict>
+              <v:shape w14:anchorId="20132DFD" id="Conector de Seta Reta 146" o:spid="_x0000_s1026" type="#_x0000_t32" style="position:absolute;margin-left:186.25pt;margin-top:.6pt;width:134.2pt;height:190.05pt;flip:x;z-index:251696128;visibility:visible;mso-wrap-style:square;mso-width-percent:0;mso-height-percent:0;mso-wrap-distance-left:9pt;mso-wrap-distance-top:0;mso-wrap-distance-right:9pt;mso-wrap-distance-bottom:0;mso-position-horizontal:absolute;mso-position-horizontal-relative:text;mso-position-vertical:absolute;mso-position-vertical-relative:text;mso-width-percent:0;mso-height-percent:0;mso-width-relative:margin;mso-height-relative:margin" o:gfxdata="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" strokecolor="#4472c4 [3204]" strokeweight=".5pt">
+                <v:stroke endarrow="block" joinstyle="miter"/>
+              </v:shape>
+            </w:pict>
+          </mc:Fallback>
+        </mc:AlternateContent>
+      </w:r>
+      <w:r>
+        <w:rPr>
+          <w:sz w:val="24"/>
+          <w:szCs w:val="24"/>
+        </w:rPr>
+        <w:drawing>
+          <wp:inline distT="0" distB="0" distL="0" distR="0" wp14:anchorId="6E31E7FE" wp14:editId="2B4D6784">
+            <wp:extent cx="2588272" cy="3018765"/>
+            <wp:effectExtent l="0" t="0" r="2540" b="0"/>
+            <wp:docPr id="145" name="Imagem 145"/>
+            <wp:cNvGraphicFramePr>
+              <a:graphicFrameLocks xmlns:a="http://schemas.openxmlformats.org/drawingml/2006/main" noChangeAspect="1"/>
+            </wp:cNvGraphicFramePr>
+            <a:graphic xmlns:a="http://schemas.openxmlformats.org/drawingml/2006/main">
+              <a:graphicData uri="http://schemas.openxmlformats.org/drawingml/2006/picture">
+                <pic:pic xmlns:pic="http://schemas.openxmlformats.org/drawingml/2006/picture">
+                  <pic:nvPicPr>
+                    <pic:cNvPr id="1" name=""/>
+                    <pic:cNvPicPr/>
+                  </pic:nvPicPr>
+                  <pic:blipFill>
+                    <a:blip r:embed="rId118"/>
+                    <a:stretch>
+                      <a:fillRect/>
+                    </a:stretch>
+                  </pic:blipFill>
+                  <pic:spPr>
+                    <a:xfrm>
+                      <a:off x="0" y="0"/>
+                      <a:ext cx="2619257" cy="3054903"/>
+                    </a:xfrm>
+                    <a:prstGeom prst="rect">
+                      <a:avLst/>
+                    </a:prstGeom>
+                  </pic:spPr>
+                </pic:pic>
+              </a:graphicData>
+            </a:graphic>
+          </wp:inline>
+        </w:drawing>
+      </w:r>
+      <w:r>
+        <w:rPr>
+          <w:sz w:val="24"/>
+          <w:szCs w:val="24"/>
+        </w:rPr>
+        <w:drawing>
+          <wp:inline distT="0" distB="0" distL="0" distR="0" wp14:anchorId="6A5B8DE7" wp14:editId="555FB926">
+            <wp:extent cx="1922780" cy="2262357"/>
+            <wp:effectExtent l="0" t="0" r="1270" b="5080"/>
+            <wp:docPr id="148" name="Imagem 148"/>
+            <wp:cNvGraphicFramePr>
+              <a:graphicFrameLocks xmlns:a="http://schemas.openxmlformats.org/drawingml/2006/main" noChangeAspect="1"/>
+            </wp:cNvGraphicFramePr>
+            <a:graphic xmlns:a="http://schemas.openxmlformats.org/drawingml/2006/main">
+              <a:graphicData uri="http://schemas.openxmlformats.org/drawingml/2006/picture">
+                <pic:pic xmlns:pic="http://schemas.openxmlformats.org/drawingml/2006/picture">
+                  <pic:nvPicPr>
+                    <pic:cNvPr id="1" name=""/>
+                    <pic:cNvPicPr/>
+                  </pic:nvPicPr>
+                  <pic:blipFill>
+                    <a:blip r:embed="rId119"/>
+                    <a:stretch>
+                      <a:fillRect/>
+                    </a:stretch>
+                  </pic:blipFill>
+                  <pic:spPr>
+                    <a:xfrm>
+                      <a:off x="0" y="0"/>
+                      <a:ext cx="1922780" cy="2262357"/>
+                    </a:xfrm>
+                    <a:prstGeom prst="rect">
+                      <a:avLst/>
+                    </a:prstGeom>
+                  </pic:spPr>
+                </pic:pic>
+              </a:graphicData>
+            </a:graphic>
+          </wp:inline>
+        </w:drawing>
+      </w:r>
+    </w:p>
+    <w:p>
+      <w:pPr>
+        <w:pStyle w:val="PargrafodaLista"/>
+        <w:tabs>
+          <w:tab w:val="left" w:pos="1275"/>
+        </w:tabs>
+        <w:rPr>
+          <w:sz w:val="24"/>
+          <w:szCs w:val="24"/>
+        </w:rPr>
+      </w:pPr>
+    </w:p>
+    <w:p>
+      <w:pPr>
+        <w:pStyle w:val="PargrafodaLista"/>
+        <w:tabs>
+          <w:tab w:val="left" w:pos="1275"/>
+        </w:tabs>
+        <w:rPr>
+          <w:sz w:val="24"/>
+          <w:szCs w:val="24"/>
+        </w:rPr>
+      </w:pPr>
+    </w:p>
+    <w:p>
+      <w:pPr>
+        <w:pStyle w:val="PargrafodaLista"/>
+        <w:tabs>
+          <w:tab w:val="left" w:pos="1275"/>
+        </w:tabs>
+        <w:rPr>
+          <w:sz w:val="24"/>
+          <w:szCs w:val="24"/>
+        </w:rPr>
+      </w:pPr>
+    </w:p>
+    <w:p>
+      <w:pPr>
+        <w:pStyle w:val="PargrafodaLista"/>
+        <w:tabs>
+          <w:tab w:val="left" w:pos="1275"/>
+        </w:tabs>
+        <w:rPr>
+          <w:sz w:val="24"/>
+          <w:szCs w:val="24"/>
+        </w:rPr>
+      </w:pPr>
+    </w:p>
+    <w:p>
+      <w:pPr>
+        <w:pStyle w:val="PargrafodaLista"/>
+        <w:tabs>
+          <w:tab w:val="left" w:pos="1275"/>
+        </w:tabs>
+        <w:rPr>
+          <w:sz w:val="24"/>
+          <w:szCs w:val="24"/>
+        </w:rPr>
+      </w:pPr>
+    </w:p>
+    <w:p>
+      <w:pPr>
+        <w:pStyle w:val="PargrafodaLista"/>
+        <w:tabs>
+          <w:tab w:val="left" w:pos="1275"/>
+        </w:tabs>
+        <w:rPr>
+          <w:sz w:val="24"/>
+          <w:szCs w:val="24"/>
+        </w:rPr>
+      </w:pPr>
+    </w:p>
+    <w:p>
+      <w:pPr>
+        <w:pStyle w:val="PargrafodaLista"/>
+        <w:tabs>
+          <w:tab w:val="left" w:pos="1275"/>
+        </w:tabs>
+        <w:rPr>
+          <w:sz w:val="24"/>
+          <w:szCs w:val="24"/>
+        </w:rPr>
+      </w:pPr>
+    </w:p>
+    <w:p>
+      <w:pPr>
+        <w:pStyle w:val="PargrafodaLista"/>
+        <w:tabs>
+          <w:tab w:val="left" w:pos="1275"/>
+        </w:tabs>
+        <w:rPr>
+          <w:sz w:val="24"/>
+          <w:szCs w:val="24"/>
+        </w:rPr>
+      </w:pPr>
+      <w:r>
+        <w:rPr>
+          <w:sz w:val="24"/>
+          <w:szCs w:val="24"/>
+        </w:rPr>
+        <w:lastRenderedPageBreak/>
+        <w:t xml:space="preserve">77 </w:t>
+      </w:r>
+      <w:r>
+        <w:rPr>
+          <w:sz w:val="24"/>
+          <w:szCs w:val="24"/>
+        </w:rPr>
+        <w:t>–</w:t>
+      </w:r>
+      <w:r>
+        <w:rPr>
+          <w:sz w:val="24"/>
+          <w:szCs w:val="24"/>
+        </w:rPr>
+        <w:t xml:space="preserve"> </w:t>
+      </w:r>
+      <w:r>
+        <w:rPr>
+          <w:sz w:val="24"/>
+          <w:szCs w:val="24"/>
+        </w:rPr>
+        <w:t xml:space="preserve">E no texto que se encontra copiar </w:t>
+      </w:r>
+      <w:proofErr w:type="spellStart"/>
+      <w:r>
+        <w:rPr>
+          <w:sz w:val="24"/>
+          <w:szCs w:val="24"/>
+        </w:rPr>
+        <w:t>html</w:t>
+      </w:r>
+      <w:proofErr w:type="spellEnd"/>
+      <w:r>
+        <w:rPr>
+          <w:sz w:val="24"/>
+          <w:szCs w:val="24"/>
+        </w:rPr>
+        <w:t xml:space="preserve"> vamos clicar e colar </w:t>
+      </w:r>
+      <w:r>
+        <w:rPr>
+          <w:sz w:val="24"/>
+          <w:szCs w:val="24"/>
+        </w:rPr>
+        <w:t>na</w:t>
+      </w:r>
+      <w:r>
+        <w:rPr>
+          <w:sz w:val="24"/>
+          <w:szCs w:val="24"/>
+        </w:rPr>
+        <w:t xml:space="preserve"> nossa pagina index.html conforme imagem</w:t>
+      </w:r>
+    </w:p>
+    <w:p>
+      <w:pPr>
+        <w:pStyle w:val="PargrafodaLista"/>
+        <w:tabs>
+          <w:tab w:val="left" w:pos="1275"/>
+        </w:tabs>
+        <w:rPr>
+          <w:sz w:val="24"/>
+          <w:szCs w:val="24"/>
+        </w:rPr>
+      </w:pPr>
+    </w:p>
+    <w:p>
+      <w:pPr>
+        <w:pStyle w:val="PargrafodaLista"/>
+        <w:tabs>
+          <w:tab w:val="left" w:pos="1275"/>
+        </w:tabs>
+        <w:rPr>
+          <w:sz w:val="24"/>
+          <w:szCs w:val="24"/>
+        </w:rPr>
+      </w:pPr>
+      <w:r>
+        <w:rPr>
+          <w:sz w:val="24"/>
+          <w:szCs w:val="24"/>
+        </w:rPr>
+        <w:drawing>
+          <wp:inline distT="0" distB="0" distL="0" distR="0" wp14:anchorId="07A9DC5D" wp14:editId="416B2005">
+            <wp:extent cx="4997704" cy="2404822"/>
+            <wp:effectExtent l="0" t="0" r="0" b="0"/>
+            <wp:docPr id="150" name="Imagem 150"/>
+            <wp:cNvGraphicFramePr>
+              <a:graphicFrameLocks xmlns:a="http://schemas.openxmlformats.org/drawingml/2006/main" noChangeAspect="1"/>
+            </wp:cNvGraphicFramePr>
+            <a:graphic xmlns:a="http://schemas.openxmlformats.org/drawingml/2006/main">
+              <a:graphicData uri="http://schemas.openxmlformats.org/drawingml/2006/picture">
+                <pic:pic xmlns:pic="http://schemas.openxmlformats.org/drawingml/2006/picture">
+                  <pic:nvPicPr>
+                    <pic:cNvPr id="1" name=""/>
+                    <pic:cNvPicPr/>
+                  </pic:nvPicPr>
+                  <pic:blipFill>
+                    <a:blip r:embed="rId120"/>
+                    <a:stretch>
+                      <a:fillRect/>
+                    </a:stretch>
+                  </pic:blipFill>
+                  <pic:spPr>
+                    <a:xfrm>
+                      <a:off x="0" y="0"/>
+                      <a:ext cx="5015850" cy="2413554"/>
+                    </a:xfrm>
+                    <a:prstGeom prst="rect">
+                      <a:avLst/>
+                    </a:prstGeom>
+                  </pic:spPr>
+                </pic:pic>
+              </a:graphicData>
+            </a:graphic>
+          </wp:inline>
+        </w:drawing>
+      </w:r>
+    </w:p>
+    <w:p>
+      <w:pPr>
+        <w:pStyle w:val="PargrafodaLista"/>
+        <w:tabs>
+          <w:tab w:val="left" w:pos="1275"/>
+        </w:tabs>
+        <w:rPr>
+          <w:sz w:val="24"/>
+          <w:szCs w:val="24"/>
+        </w:rPr>
+      </w:pPr>
+      <w:r>
+        <w:rPr>
+          <w:noProof/>
+          <w:sz w:val="24"/>
+          <w:szCs w:val="24"/>
+        </w:rPr>
+        <mc:AlternateContent>
+          <mc:Choice Requires="wps">
+            <w:drawing>
+              <wp:anchor distT="0" distB="0" distL="114300" distR="114300" simplePos="0" relativeHeight="251699200" behindDoc="0" locked="0" layoutInCell="1" allowOverlap="1">
+                <wp:simplePos x="0" y="0"/>
+                <wp:positionH relativeFrom="column">
+                  <wp:posOffset>2387270</wp:posOffset>
+                </wp:positionH>
+                <wp:positionV relativeFrom="paragraph">
+                  <wp:posOffset>1301293</wp:posOffset>
+                </wp:positionV>
+                <wp:extent cx="643737" cy="1170432"/>
+                <wp:effectExtent l="38100" t="38100" r="23495" b="29845"/>
+                <wp:wrapNone/>
+                <wp:docPr id="153" name="Conector de Seta Reta 153"/>
+                <wp:cNvGraphicFramePr/>
+                <a:graphic xmlns:a="http://schemas.openxmlformats.org/drawingml/2006/main">
+                  <a:graphicData uri="http://schemas.microsoft.com/office/word/2010/wordprocessingShape">
+                    <wps:wsp>
+                      <wps:cNvCnPr/>
+                      <wps:spPr>
+                        <a:xfrm flipH="1" flipV="1">
+                          <a:off x="0" y="0"/>
+                          <a:ext cx="643737" cy="1170432"/>
+                        </a:xfrm>
+                        <a:prstGeom prst="straightConnector1">
+                          <a:avLst/>
+                        </a:prstGeom>
+                        <a:ln>
+                          <a:tailEnd type="triangle"/>
+                        </a:ln>
+                      </wps:spPr>
+                      <wps:style>
+                        <a:lnRef idx="1">
+                          <a:schemeClr val="accent1"/>
+                        </a:lnRef>
+                        <a:fillRef idx="0">
+                          <a:schemeClr val="accent1"/>
+                        </a:fillRef>
+                        <a:effectRef idx="0">
+                          <a:schemeClr val="accent1"/>
+                        </a:effectRef>
+                        <a:fontRef idx="minor">
+                          <a:schemeClr val="tx1"/>
+                        </a:fontRef>
+                      </wps:style>
+                      <wps:bodyPr/>
+                    </wps:wsp>
+                  </a:graphicData>
+                </a:graphic>
+              </wp:anchor>
+            </w:drawing>
+          </mc:Choice>
+          <mc:Fallback>
+            <w:pict>
+              <v:shape w14:anchorId="1E4F64F7" id="Conector de Seta Reta 153" o:spid="_x0000_s1026" type="#_x0000_t32" style="position:absolute;margin-left:187.95pt;margin-top:102.45pt;width:50.7pt;height:92.15pt;flip:x y;z-index:251699200;visibility:visible;mso-wrap-style:square;mso-wrap-distance-left:9pt;mso-wrap-distance-top:0;mso-wrap-distance-right:9pt;mso-wrap-distance-bottom:0;mso-position-horizontal:absolute;mso-position-horizontal-relative:text;mso-position-vertical:absolute;mso-position-vertical-relative:text" o:gfxdata="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" strokecolor="#4472c4 [3204]" strokeweight=".5pt">
+                <v:stroke endarrow="block" joinstyle="miter"/>
+              </v:shape>
+            </w:pict>
+          </mc:Fallback>
+        </mc:AlternateContent>
+      </w:r>
+      <w:r>
+        <w:rPr>
+          <w:noProof/>
+          <w:sz w:val="24"/>
+          <w:szCs w:val="24"/>
+        </w:rPr>
+        <mc:AlternateContent>
+          <mc:Choice Requires="wps">
+            <w:drawing>
+              <wp:anchor distT="0" distB="0" distL="114300" distR="114300" simplePos="0" relativeHeight="251698176" behindDoc="0" locked="0" layoutInCell="1" allowOverlap="1">
+                <wp:simplePos x="0" y="0"/>
+                <wp:positionH relativeFrom="column">
+                  <wp:posOffset>1670380</wp:posOffset>
+                </wp:positionH>
+                <wp:positionV relativeFrom="paragraph">
+                  <wp:posOffset>1330554</wp:posOffset>
+                </wp:positionV>
+                <wp:extent cx="365760" cy="1119225"/>
+                <wp:effectExtent l="38100" t="38100" r="34290" b="24130"/>
+                <wp:wrapNone/>
+                <wp:docPr id="152" name="Conector de Seta Reta 152"/>
+                <wp:cNvGraphicFramePr/>
+                <a:graphic xmlns:a="http://schemas.openxmlformats.org/drawingml/2006/main">
+                  <a:graphicData uri="http://schemas.microsoft.com/office/word/2010/wordprocessingShape">
+                    <wps:wsp>
+                      <wps:cNvCnPr/>
+                      <wps:spPr>
+                        <a:xfrm flipH="1" flipV="1">
+                          <a:off x="0" y="0"/>
+                          <a:ext cx="365760" cy="1119225"/>
+                        </a:xfrm>
+                        <a:prstGeom prst="straightConnector1">
+                          <a:avLst/>
+                        </a:prstGeom>
+                        <a:ln>
+                          <a:tailEnd type="triangle"/>
+                        </a:ln>
+                      </wps:spPr>
+                      <wps:style>
+                        <a:lnRef idx="1">
+                          <a:schemeClr val="accent1"/>
+                        </a:lnRef>
+                        <a:fillRef idx="0">
+                          <a:schemeClr val="accent1"/>
+                        </a:fillRef>
+                        <a:effectRef idx="0">
+                          <a:schemeClr val="accent1"/>
+                        </a:effectRef>
+                        <a:fontRef idx="minor">
+                          <a:schemeClr val="tx1"/>
+                        </a:fontRef>
+                      </wps:style>
+                      <wps:bodyPr/>
+                    </wps:wsp>
+                  </a:graphicData>
+                </a:graphic>
+              </wp:anchor>
+            </w:drawing>
+          </mc:Choice>
+          <mc:Fallback>
+            <w:pict>
+              <v:shape w14:anchorId="35E92C0E" id="Conector de Seta Reta 152" o:spid="_x0000_s1026" type="#_x0000_t32" style="position:absolute;margin-left:131.55pt;margin-top:104.75pt;width:28.8pt;height:88.15pt;flip:x y;z-index:251698176;visibility:visible;mso-wrap-style:square;mso-wrap-distance-left:9pt;mso-wrap-distance-top:0;mso-wrap-distance-right:9pt;mso-wrap-distance-bottom:0;mso-position-horizontal:absolute;mso-position-horizontal-relative:text;mso-position-vertical:absolute;mso-position-vertical-relative:text" o:gfxdata="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" strokecolor="#4472c4 [3204]" strokeweight=".5pt">
+                <v:stroke endarrow="block" joinstyle="miter"/>
+              </v:shape>
+            </w:pict>
+          </mc:Fallback>
+        </mc:AlternateContent>
+      </w:r>
+      <w:r>
+        <w:rPr>
+          <w:sz w:val="24"/>
+          <w:szCs w:val="24"/>
+        </w:rPr>
+        <w:drawing>
+          <wp:inline distT="0" distB="0" distL="0" distR="0" wp14:anchorId="4F6F617C" wp14:editId="0698FD52">
+            <wp:extent cx="5400040" cy="1924685"/>
+            <wp:effectExtent l="0" t="0" r="0" b="0"/>
+            <wp:docPr id="151" name="Imagem 151"/>
+            <wp:cNvGraphicFramePr>
+              <a:graphicFrameLocks xmlns:a="http://schemas.openxmlformats.org/drawingml/2006/main" noChangeAspect="1"/>
+            </wp:cNvGraphicFramePr>
+            <a:graphic xmlns:a="http://schemas.openxmlformats.org/drawingml/2006/main">
+              <a:graphicData uri="http://schemas.openxmlformats.org/drawingml/2006/picture">
+                <pic:pic xmlns:pic="http://schemas.openxmlformats.org/drawingml/2006/picture">
+                  <pic:nvPicPr>
+                    <pic:cNvPr id="1" name=""/>
+                    <pic:cNvPicPr/>
+                  </pic:nvPicPr>
+                  <pic:blipFill>
+                    <a:blip r:embed="rId121"/>
+                    <a:stretch>
+                      <a:fillRect/>
+                    </a:stretch>
+                  </pic:blipFill>
+                  <pic:spPr>
+                    <a:xfrm>
+                      <a:off x="0" y="0"/>
+                      <a:ext cx="5400040" cy="1924685"/>
+                    </a:xfrm>
+                    <a:prstGeom prst="rect">
+                      <a:avLst/>
+                    </a:prstGeom>
+                  </pic:spPr>
+                </pic:pic>
+              </a:graphicData>
+            </a:graphic>
+          </wp:inline>
+        </w:drawing>
+      </w:r>
+    </w:p>
+    <w:p>
+      <w:pPr>
+        <w:pStyle w:val="PargrafodaLista"/>
+        <w:tabs>
+          <w:tab w:val="left" w:pos="1275"/>
+        </w:tabs>
+        <w:rPr>
+          <w:sz w:val="24"/>
+          <w:szCs w:val="24"/>
+        </w:rPr>
+      </w:pPr>
+    </w:p>
+    <w:p>
+      <w:pPr>
+        <w:pStyle w:val="PargrafodaLista"/>
+        <w:tabs>
+          <w:tab w:val="left" w:pos="1275"/>
+        </w:tabs>
+        <w:rPr>
+          <w:sz w:val="24"/>
+          <w:szCs w:val="24"/>
+        </w:rPr>
+      </w:pPr>
+      <w:r>
+        <w:rPr>
+          <w:sz w:val="24"/>
+          <w:szCs w:val="24"/>
+        </w:rPr>
+        <w:t xml:space="preserve">78 – Para melhorar  a largura do mapa em nossa pagina no </w:t>
+      </w:r>
+      <w:proofErr w:type="spellStart"/>
+      <w:r>
+        <w:rPr>
+          <w:sz w:val="24"/>
+          <w:szCs w:val="24"/>
+        </w:rPr>
+        <w:t>html</w:t>
+      </w:r>
+      <w:proofErr w:type="spellEnd"/>
+      <w:r>
+        <w:rPr>
+          <w:sz w:val="24"/>
+          <w:szCs w:val="24"/>
+        </w:rPr>
+        <w:t xml:space="preserve"> na </w:t>
+      </w:r>
+      <w:proofErr w:type="spellStart"/>
+      <w:r>
+        <w:rPr>
+          <w:sz w:val="24"/>
+          <w:szCs w:val="24"/>
+        </w:rPr>
+        <w:t>tag</w:t>
+      </w:r>
+      <w:proofErr w:type="spellEnd"/>
+      <w:r>
+        <w:rPr>
+          <w:sz w:val="24"/>
+          <w:szCs w:val="24"/>
+        </w:rPr>
+        <w:t xml:space="preserve"> </w:t>
+      </w:r>
+      <w:proofErr w:type="spellStart"/>
+      <w:r>
+        <w:rPr>
+          <w:sz w:val="24"/>
+          <w:szCs w:val="24"/>
+        </w:rPr>
+        <w:t>i</w:t>
+      </w:r>
+      <w:r>
+        <w:rPr>
+          <w:sz w:val="24"/>
+          <w:szCs w:val="24"/>
+        </w:rPr>
+        <w:t>frame</w:t>
+      </w:r>
+      <w:proofErr w:type="spellEnd"/>
+      <w:r>
+        <w:rPr>
+          <w:sz w:val="24"/>
+          <w:szCs w:val="24"/>
+        </w:rPr>
+        <w:t xml:space="preserve"> no </w:t>
+      </w:r>
+      <w:proofErr w:type="spellStart"/>
+      <w:r>
+        <w:rPr>
+          <w:sz w:val="24"/>
+          <w:szCs w:val="24"/>
+        </w:rPr>
+        <w:t>witdth</w:t>
+      </w:r>
+      <w:proofErr w:type="spellEnd"/>
+      <w:r>
+        <w:rPr>
+          <w:sz w:val="24"/>
+          <w:szCs w:val="24"/>
+        </w:rPr>
+        <w:t xml:space="preserve"> colocamos 100% e na altura 300 conforme imagem acima</w:t>
+      </w:r>
+    </w:p>
+    <w:p>
+      <w:pPr>
+        <w:pStyle w:val="PargrafodaLista"/>
+        <w:tabs>
+          <w:tab w:val="left" w:pos="1275"/>
+        </w:tabs>
+        <w:rPr>
+          <w:sz w:val="24"/>
+          <w:szCs w:val="24"/>
+        </w:rPr>
+      </w:pPr>
+    </w:p>
+    <w:p>
+      <w:pPr>
+        <w:pStyle w:val="PargrafodaLista"/>
+        <w:tabs>
+          <w:tab w:val="left" w:pos="1275"/>
+        </w:tabs>
+        <w:rPr>
+          <w:sz w:val="24"/>
+          <w:szCs w:val="24"/>
+        </w:rPr>
+      </w:pPr>
+      <w:r>
+        <w:rPr>
+          <w:sz w:val="24"/>
+          <w:szCs w:val="24"/>
+        </w:rPr>
+        <w:t xml:space="preserve">79 – No </w:t>
+      </w:r>
+      <w:proofErr w:type="spellStart"/>
+      <w:r>
+        <w:rPr>
+          <w:sz w:val="24"/>
+          <w:szCs w:val="24"/>
+        </w:rPr>
+        <w:t>css</w:t>
+      </w:r>
+      <w:proofErr w:type="spellEnd"/>
+      <w:r>
+        <w:rPr>
+          <w:sz w:val="24"/>
+          <w:szCs w:val="24"/>
+        </w:rPr>
+        <w:t xml:space="preserve"> </w:t>
+      </w:r>
+      <w:r>
+        <w:rPr>
+          <w:sz w:val="24"/>
+          <w:szCs w:val="24"/>
+        </w:rPr>
+        <w:t xml:space="preserve">na </w:t>
+      </w:r>
+      <w:proofErr w:type="spellStart"/>
+      <w:r>
+        <w:rPr>
+          <w:sz w:val="24"/>
+          <w:szCs w:val="24"/>
+        </w:rPr>
+        <w:t>class</w:t>
+      </w:r>
+      <w:proofErr w:type="spellEnd"/>
+      <w:r>
+        <w:rPr>
+          <w:sz w:val="24"/>
+          <w:szCs w:val="24"/>
+        </w:rPr>
+        <w:t xml:space="preserve"> mapa colocamos um espaço interno tanto para cima como para baixo e demos um espaço externo no parágrafo para baixo conforme imagem de código.</w:t>
+      </w:r>
+    </w:p>
+    <w:p>
+      <w:pPr>
+        <w:pStyle w:val="PargrafodaLista"/>
+        <w:tabs>
+          <w:tab w:val="left" w:pos="1275"/>
+        </w:tabs>
+        <w:rPr>
+          <w:sz w:val="24"/>
+          <w:szCs w:val="24"/>
+        </w:rPr>
+      </w:pPr>
+      <w:r>
+        <w:rPr>
+          <w:sz w:val="24"/>
+          <w:szCs w:val="24"/>
+        </w:rPr>
+        <w:drawing>
+          <wp:inline distT="0" distB="0" distL="0" distR="0" wp14:anchorId="42B38D4F" wp14:editId="403A8E90">
+            <wp:extent cx="4858428" cy="2400635"/>
+            <wp:effectExtent l="0" t="0" r="0" b="0"/>
+            <wp:docPr id="154" name="Imagem 154"/>
+            <wp:cNvGraphicFramePr>
+              <a:graphicFrameLocks xmlns:a="http://schemas.openxmlformats.org/drawingml/2006/main" noChangeAspect="1"/>
+            </wp:cNvGraphicFramePr>
+            <a:graphic xmlns:a="http://schemas.openxmlformats.org/drawingml/2006/main">
+              <a:graphicData uri="http://schemas.openxmlformats.org/drawingml/2006/picture">
+                <pic:pic xmlns:pic="http://schemas.openxmlformats.org/drawingml/2006/picture">
+                  <pic:nvPicPr>
+                    <pic:cNvPr id="1" name=""/>
+                    <pic:cNvPicPr/>
+                  </pic:nvPicPr>
+                  <pic:blipFill>
+                    <a:blip r:embed="rId122"/>
+                    <a:stretch>
+                      <a:fillRect/>
+                    </a:stretch>
+                  </pic:blipFill>
+                  <pic:spPr>
+                    <a:xfrm>
+                      <a:off x="0" y="0"/>
+                      <a:ext cx="4858428" cy="2400635"/>
+                    </a:xfrm>
+                    <a:prstGeom prst="rect">
+                      <a:avLst/>
+                    </a:prstGeom>
+                  </pic:spPr>
+                </pic:pic>
+              </a:graphicData>
+            </a:graphic>
+          </wp:inline>
+        </w:drawing>
+      </w:r>
+      <w:bookmarkStart w:id="0" w:name="_GoBack"/>
       <w:bookmarkEnd w:id="0"/>
-    </w:p>
-    <w:p>
-      <w:pPr>
-        <w:pStyle w:val="PargrafodaLista"/>
-        <w:tabs>
-          <w:tab w:val="left" w:pos="1275"/>
-        </w:tabs>
-        <w:rPr>
-          <w:sz w:val="24"/>
-          <w:szCs w:val="24"/>
-        </w:rPr>
-      </w:pPr>
-    </w:p>
-    <w:p>
-      <w:pPr>
-        <w:pStyle w:val="PargrafodaLista"/>
-        <w:tabs>
-          <w:tab w:val="left" w:pos="1275"/>
-        </w:tabs>
-        <w:rPr>
-          <w:sz w:val="24"/>
-          <w:szCs w:val="24"/>
-        </w:rPr>
-      </w:pPr>
-    </w:p>
-    <w:p>
-      <w:pPr>
-        <w:pStyle w:val="PargrafodaLista"/>
-        <w:tabs>
-          <w:tab w:val="left" w:pos="1275"/>
-        </w:tabs>
-        <w:rPr>
-          <w:sz w:val="24"/>
-          <w:szCs w:val="24"/>
-        </w:rPr>
-      </w:pPr>
-    </w:p>
-    <w:p>
-      <w:pPr>
-        <w:pStyle w:val="PargrafodaLista"/>
-        <w:tabs>
-          <w:tab w:val="left" w:pos="1275"/>
-        </w:tabs>
-        <w:rPr>
-          <w:sz w:val="24"/>
-          <w:szCs w:val="24"/>
-        </w:rPr>
-      </w:pPr>
-    </w:p>
-    <w:p>
-      <w:pPr>
-        <w:pStyle w:val="PargrafodaLista"/>
-        <w:tabs>
-          <w:tab w:val="left" w:pos="1275"/>
-        </w:tabs>
-        <w:rPr>
-          <w:sz w:val="24"/>
-          <w:szCs w:val="24"/>
-        </w:rPr>
-      </w:pPr>
     </w:p>
     <w:sectPr>
       <w:pgSz w:w="11906" w:h="16838"/>
@@ -17173,7 +18676,7 @@
 </file>
 
 <file path=customXml/itemProps1.xml><?xml version="1.0" encoding="utf-8"?>
-<ds:datastoreItem xmlns:ds="http://schemas.openxmlformats.org/officeDocument/2006/customXml" ds:itemID="{3E60E94C-D4A8-47CE-9611-464D2EC5D635}">
+<ds:datastoreItem xmlns:ds="http://schemas.openxmlformats.org/officeDocument/2006/customXml" ds:itemID="{3374060B-0759-4390-9EE9-6A74F35BD728}">
   <ds:schemaRefs>
     <ds:schemaRef ds:uri="http://schemas.openxmlformats.org/officeDocument/2006/bibliography"/>
   </ds:schemaRefs>

</xml_diff>

<commit_message>
atualizaçaõ da aula dia 06/10/2026
</commit_message>
<xml_diff>
--- a/apostila/Apostila Space For Men.docx
+++ b/apostila/Apostila Space For Men.docx
@@ -15038,23 +15038,7 @@
           <w:sz w:val="24"/>
           <w:szCs w:val="24"/>
         </w:rPr>
-        <w:t xml:space="preserve"> para retornar </w:t>
-      </w:r>
-      <w:proofErr w:type="gramStart"/>
-      <w:r>
-        <w:rPr>
-          <w:sz w:val="24"/>
-          <w:szCs w:val="24"/>
-        </w:rPr>
-        <w:t>a</w:t>
-      </w:r>
-      <w:proofErr w:type="gramEnd"/>
-      <w:r>
-        <w:rPr>
-          <w:sz w:val="24"/>
-          <w:szCs w:val="24"/>
-        </w:rPr>
-        <w:t xml:space="preserve"> posição dos elementos abaixo da imagem que utilizamos o </w:t>
+        <w:t xml:space="preserve"> para retornar a posição dos elementos abaixo da imagem que utilizamos o </w:t>
       </w:r>
       <w:proofErr w:type="spellStart"/>
       <w:r>
@@ -15954,6 +15938,7 @@
       </w:pPr>
       <w:r>
         <w:rPr>
+          <w:noProof/>
           <w:sz w:val="24"/>
           <w:szCs w:val="24"/>
         </w:rPr>
@@ -16373,6 +16358,7 @@
       </w:pPr>
       <w:r>
         <w:rPr>
+          <w:noProof/>
           <w:sz w:val="24"/>
           <w:szCs w:val="24"/>
         </w:rPr>
@@ -16613,6 +16599,7 @@
       </w:r>
       <w:r>
         <w:rPr>
+          <w:noProof/>
           <w:sz w:val="24"/>
           <w:szCs w:val="24"/>
         </w:rPr>
@@ -16654,6 +16641,7 @@
       </w:r>
       <w:r>
         <w:rPr>
+          <w:noProof/>
           <w:sz w:val="24"/>
           <w:szCs w:val="24"/>
         </w:rPr>
@@ -16874,6 +16862,7 @@
       </w:pPr>
       <w:r>
         <w:rPr>
+          <w:noProof/>
           <w:sz w:val="24"/>
           <w:szCs w:val="24"/>
         </w:rPr>
@@ -17063,6 +17052,7 @@
       </w:r>
       <w:r>
         <w:rPr>
+          <w:noProof/>
           <w:sz w:val="24"/>
           <w:szCs w:val="24"/>
         </w:rPr>
@@ -17131,7 +17121,7 @@
           <w:sz w:val="24"/>
           <w:szCs w:val="24"/>
         </w:rPr>
-        <w:t xml:space="preserve">78 – Para melhorar  a largura do mapa em nossa pagina no </w:t>
+        <w:t xml:space="preserve">78 – Para melhorar  a largura do mapa em nossa </w:t>
       </w:r>
       <w:proofErr w:type="spellStart"/>
       <w:r>
@@ -17139,6 +17129,22 @@
           <w:sz w:val="24"/>
           <w:szCs w:val="24"/>
         </w:rPr>
+        <w:t>pagina</w:t>
+      </w:r>
+      <w:proofErr w:type="spellEnd"/>
+      <w:r>
+        <w:rPr>
+          <w:sz w:val="24"/>
+          <w:szCs w:val="24"/>
+        </w:rPr>
+        <w:t xml:space="preserve"> no </w:t>
+      </w:r>
+      <w:proofErr w:type="spellStart"/>
+      <w:r>
+        <w:rPr>
+          <w:sz w:val="24"/>
+          <w:szCs w:val="24"/>
+        </w:rPr>
         <w:t>html</w:t>
       </w:r>
       <w:proofErr w:type="spellEnd"/>
@@ -17288,6 +17294,7 @@
       </w:pPr>
       <w:r>
         <w:rPr>
+          <w:noProof/>
           <w:sz w:val="24"/>
           <w:szCs w:val="24"/>
         </w:rPr>
@@ -17327,6 +17334,1570 @@
           </wp:inline>
         </w:drawing>
       </w:r>
+    </w:p>
+    <w:p>
+      <w:pPr>
+        <w:pStyle w:val="PargrafodaLista"/>
+        <w:tabs>
+          <w:tab w:val="left" w:pos="1275"/>
+        </w:tabs>
+        <w:rPr>
+          <w:sz w:val="24"/>
+          <w:szCs w:val="24"/>
+        </w:rPr>
+      </w:pPr>
+    </w:p>
+    <w:p>
+      <w:pPr>
+        <w:pStyle w:val="PargrafodaLista"/>
+        <w:tabs>
+          <w:tab w:val="left" w:pos="1275"/>
+        </w:tabs>
+        <w:rPr>
+          <w:sz w:val="24"/>
+          <w:szCs w:val="24"/>
+        </w:rPr>
+      </w:pPr>
+      <w:r>
+        <w:rPr>
+          <w:sz w:val="24"/>
+          <w:szCs w:val="24"/>
+        </w:rPr>
+        <w:t>80 – Adicionando vídeo d</w:t>
+      </w:r>
+      <w:r>
+        <w:rPr>
+          <w:sz w:val="24"/>
+          <w:szCs w:val="24"/>
+        </w:rPr>
+        <w:t>o</w:t>
+      </w:r>
+      <w:r>
+        <w:rPr>
+          <w:sz w:val="24"/>
+          <w:szCs w:val="24"/>
+        </w:rPr>
+        <w:t xml:space="preserve"> </w:t>
+      </w:r>
+      <w:proofErr w:type="spellStart"/>
+      <w:r>
+        <w:rPr>
+          <w:sz w:val="24"/>
+          <w:szCs w:val="24"/>
+        </w:rPr>
+        <w:t>youtube</w:t>
+      </w:r>
+      <w:proofErr w:type="spellEnd"/>
+      <w:r>
+        <w:rPr>
+          <w:sz w:val="24"/>
+          <w:szCs w:val="24"/>
+        </w:rPr>
+        <w:t xml:space="preserve"> em nosso site</w:t>
+      </w:r>
+    </w:p>
+    <w:p>
+      <w:pPr>
+        <w:pStyle w:val="PargrafodaLista"/>
+        <w:numPr>
+          <w:ilvl w:val="0"/>
+          <w:numId w:val="4"/>
+        </w:numPr>
+        <w:tabs>
+          <w:tab w:val="left" w:pos="1275"/>
+        </w:tabs>
+        <w:rPr>
+          <w:sz w:val="24"/>
+          <w:szCs w:val="24"/>
+        </w:rPr>
+      </w:pPr>
+      <w:r>
+        <w:rPr>
+          <w:sz w:val="24"/>
+          <w:szCs w:val="24"/>
+        </w:rPr>
+        <w:t xml:space="preserve">Entra no site do </w:t>
+      </w:r>
+      <w:proofErr w:type="spellStart"/>
+      <w:r>
+        <w:rPr>
+          <w:sz w:val="24"/>
+          <w:szCs w:val="24"/>
+        </w:rPr>
+        <w:t>Youtube</w:t>
+      </w:r>
+      <w:proofErr w:type="spellEnd"/>
+      <w:r>
+        <w:rPr>
+          <w:sz w:val="24"/>
+          <w:szCs w:val="24"/>
+        </w:rPr>
+        <w:t xml:space="preserve"> escolhe o vídeo desejado.</w:t>
+      </w:r>
+    </w:p>
+    <w:p>
+      <w:pPr>
+        <w:pStyle w:val="PargrafodaLista"/>
+        <w:numPr>
+          <w:ilvl w:val="0"/>
+          <w:numId w:val="4"/>
+        </w:numPr>
+        <w:tabs>
+          <w:tab w:val="left" w:pos="1275"/>
+        </w:tabs>
+        <w:rPr>
+          <w:sz w:val="24"/>
+          <w:szCs w:val="24"/>
+        </w:rPr>
+      </w:pPr>
+      <w:r>
+        <w:rPr>
+          <w:sz w:val="24"/>
+          <w:szCs w:val="24"/>
+        </w:rPr>
+        <w:t xml:space="preserve">Logo a baixo do vídeo </w:t>
+      </w:r>
+      <w:r>
+        <w:rPr>
+          <w:sz w:val="24"/>
+          <w:szCs w:val="24"/>
+        </w:rPr>
+        <w:t>clicar no botão compartilhar</w:t>
+      </w:r>
+    </w:p>
+    <w:p>
+      <w:pPr>
+        <w:pStyle w:val="PargrafodaLista"/>
+        <w:numPr>
+          <w:ilvl w:val="0"/>
+          <w:numId w:val="4"/>
+        </w:numPr>
+        <w:tabs>
+          <w:tab w:val="left" w:pos="1275"/>
+        </w:tabs>
+        <w:rPr>
+          <w:sz w:val="24"/>
+          <w:szCs w:val="24"/>
+        </w:rPr>
+      </w:pPr>
+      <w:r>
+        <w:rPr>
+          <w:sz w:val="24"/>
+          <w:szCs w:val="24"/>
+        </w:rPr>
+        <w:t>Escolher a opção incorporar</w:t>
+      </w:r>
+    </w:p>
+    <w:p>
+      <w:pPr>
+        <w:pStyle w:val="PargrafodaLista"/>
+        <w:numPr>
+          <w:ilvl w:val="0"/>
+          <w:numId w:val="4"/>
+        </w:numPr>
+        <w:tabs>
+          <w:tab w:val="left" w:pos="1275"/>
+        </w:tabs>
+        <w:rPr>
+          <w:sz w:val="24"/>
+          <w:szCs w:val="24"/>
+        </w:rPr>
+      </w:pPr>
+      <w:r>
+        <w:rPr>
+          <w:sz w:val="24"/>
+          <w:szCs w:val="24"/>
+        </w:rPr>
+        <w:t xml:space="preserve">Copiar o link que surgiu e colar na </w:t>
+      </w:r>
+      <w:proofErr w:type="spellStart"/>
+      <w:r>
+        <w:rPr>
+          <w:sz w:val="24"/>
+          <w:szCs w:val="24"/>
+        </w:rPr>
+        <w:t>pagina</w:t>
+      </w:r>
+      <w:proofErr w:type="spellEnd"/>
+      <w:r>
+        <w:rPr>
+          <w:sz w:val="24"/>
+          <w:szCs w:val="24"/>
+        </w:rPr>
+        <w:t xml:space="preserve"> </w:t>
+      </w:r>
+      <w:proofErr w:type="spellStart"/>
+      <w:r>
+        <w:rPr>
+          <w:sz w:val="24"/>
+          <w:szCs w:val="24"/>
+        </w:rPr>
+        <w:t>html</w:t>
+      </w:r>
+      <w:proofErr w:type="spellEnd"/>
+      <w:r>
+        <w:rPr>
+          <w:sz w:val="24"/>
+          <w:szCs w:val="24"/>
+        </w:rPr>
+        <w:t xml:space="preserve"> que estamos trabalhando.</w:t>
+      </w:r>
+    </w:p>
+    <w:p>
+      <w:pPr>
+        <w:pStyle w:val="PargrafodaLista"/>
+        <w:numPr>
+          <w:ilvl w:val="0"/>
+          <w:numId w:val="4"/>
+        </w:numPr>
+        <w:tabs>
+          <w:tab w:val="left" w:pos="1275"/>
+        </w:tabs>
+        <w:rPr>
+          <w:sz w:val="24"/>
+          <w:szCs w:val="24"/>
+        </w:rPr>
+      </w:pPr>
+      <w:r>
+        <w:rPr>
+          <w:sz w:val="24"/>
+          <w:szCs w:val="24"/>
+        </w:rPr>
+        <w:t xml:space="preserve">Criamos um </w:t>
+      </w:r>
+      <w:proofErr w:type="spellStart"/>
+      <w:r>
+        <w:rPr>
+          <w:sz w:val="24"/>
+          <w:szCs w:val="24"/>
+        </w:rPr>
+        <w:t>div</w:t>
+      </w:r>
+      <w:proofErr w:type="spellEnd"/>
+      <w:r>
+        <w:rPr>
+          <w:sz w:val="24"/>
+          <w:szCs w:val="24"/>
+        </w:rPr>
+        <w:t xml:space="preserve"> para trabalhar com o vídeo.</w:t>
+      </w:r>
+    </w:p>
+    <w:p>
+      <w:pPr>
+        <w:pStyle w:val="PargrafodaLista"/>
+        <w:tabs>
+          <w:tab w:val="left" w:pos="1275"/>
+        </w:tabs>
+        <w:rPr>
+          <w:sz w:val="24"/>
+          <w:szCs w:val="24"/>
+        </w:rPr>
+      </w:pPr>
+      <w:r>
+        <w:rPr>
+          <w:noProof/>
+          <w:sz w:val="24"/>
+          <w:szCs w:val="24"/>
+        </w:rPr>
+        <w:drawing>
+          <wp:inline distT="0" distB="0" distL="0" distR="0" wp14:anchorId="037691D7" wp14:editId="2CE48E34">
+            <wp:extent cx="5400040" cy="1113155"/>
+            <wp:effectExtent l="0" t="0" r="0" b="0"/>
+            <wp:docPr id="144" name="Imagem 144"/>
+            <wp:cNvGraphicFramePr>
+              <a:graphicFrameLocks xmlns:a="http://schemas.openxmlformats.org/drawingml/2006/main" noChangeAspect="1"/>
+            </wp:cNvGraphicFramePr>
+            <a:graphic xmlns:a="http://schemas.openxmlformats.org/drawingml/2006/main">
+              <a:graphicData uri="http://schemas.openxmlformats.org/drawingml/2006/picture">
+                <pic:pic xmlns:pic="http://schemas.openxmlformats.org/drawingml/2006/picture">
+                  <pic:nvPicPr>
+                    <pic:cNvPr id="1" name=""/>
+                    <pic:cNvPicPr/>
+                  </pic:nvPicPr>
+                  <pic:blipFill>
+                    <a:blip r:embed="rId123"/>
+                    <a:stretch>
+                      <a:fillRect/>
+                    </a:stretch>
+                  </pic:blipFill>
+                  <pic:spPr>
+                    <a:xfrm>
+                      <a:off x="0" y="0"/>
+                      <a:ext cx="5400040" cy="1113155"/>
+                    </a:xfrm>
+                    <a:prstGeom prst="rect">
+                      <a:avLst/>
+                    </a:prstGeom>
+                  </pic:spPr>
+                </pic:pic>
+              </a:graphicData>
+            </a:graphic>
+          </wp:inline>
+        </w:drawing>
+      </w:r>
+    </w:p>
+    <w:p>
+      <w:pPr>
+        <w:pStyle w:val="PargrafodaLista"/>
+        <w:tabs>
+          <w:tab w:val="left" w:pos="1275"/>
+        </w:tabs>
+        <w:rPr>
+          <w:sz w:val="24"/>
+          <w:szCs w:val="24"/>
+        </w:rPr>
+      </w:pPr>
+    </w:p>
+    <w:p>
+      <w:pPr>
+        <w:pStyle w:val="PargrafodaLista"/>
+        <w:tabs>
+          <w:tab w:val="left" w:pos="1275"/>
+        </w:tabs>
+        <w:rPr>
+          <w:sz w:val="24"/>
+          <w:szCs w:val="24"/>
+        </w:rPr>
+      </w:pPr>
+      <w:r>
+        <w:rPr>
+          <w:sz w:val="24"/>
+          <w:szCs w:val="24"/>
+        </w:rPr>
+        <w:t xml:space="preserve">81 </w:t>
+      </w:r>
+      <w:r>
+        <w:rPr>
+          <w:sz w:val="24"/>
+          <w:szCs w:val="24"/>
+        </w:rPr>
+        <w:t>–</w:t>
+      </w:r>
+      <w:r>
+        <w:rPr>
+          <w:sz w:val="24"/>
+          <w:szCs w:val="24"/>
+        </w:rPr>
+        <w:t xml:space="preserve"> </w:t>
+      </w:r>
+      <w:r>
+        <w:rPr>
+          <w:sz w:val="24"/>
+          <w:szCs w:val="24"/>
+        </w:rPr>
+        <w:t xml:space="preserve">Adicionamos uma largura na </w:t>
+      </w:r>
+      <w:proofErr w:type="spellStart"/>
+      <w:r>
+        <w:rPr>
+          <w:sz w:val="24"/>
+          <w:szCs w:val="24"/>
+        </w:rPr>
+        <w:t>div</w:t>
+      </w:r>
+      <w:proofErr w:type="spellEnd"/>
+      <w:r>
+        <w:rPr>
+          <w:sz w:val="24"/>
+          <w:szCs w:val="24"/>
+        </w:rPr>
+        <w:t xml:space="preserve"> vídeo de 560px e centralizamos usando o espaço externo.</w:t>
+      </w:r>
+    </w:p>
+    <w:p>
+      <w:pPr>
+        <w:pStyle w:val="PargrafodaLista"/>
+        <w:tabs>
+          <w:tab w:val="left" w:pos="1275"/>
+        </w:tabs>
+        <w:rPr>
+          <w:sz w:val="24"/>
+          <w:szCs w:val="24"/>
+        </w:rPr>
+      </w:pPr>
+    </w:p>
+    <w:p>
+      <w:pPr>
+        <w:pStyle w:val="PargrafodaLista"/>
+        <w:tabs>
+          <w:tab w:val="left" w:pos="1275"/>
+        </w:tabs>
+        <w:rPr>
+          <w:sz w:val="24"/>
+          <w:szCs w:val="24"/>
+        </w:rPr>
+      </w:pPr>
+      <w:r>
+        <w:rPr>
+          <w:noProof/>
+          <w:sz w:val="24"/>
+          <w:szCs w:val="24"/>
+        </w:rPr>
+        <w:drawing>
+          <wp:inline distT="0" distB="0" distL="0" distR="0" wp14:anchorId="2FD5B705" wp14:editId="76EDE416">
+            <wp:extent cx="2257740" cy="981212"/>
+            <wp:effectExtent l="0" t="0" r="9525" b="9525"/>
+            <wp:docPr id="147" name="Imagem 147"/>
+            <wp:cNvGraphicFramePr>
+              <a:graphicFrameLocks xmlns:a="http://schemas.openxmlformats.org/drawingml/2006/main" noChangeAspect="1"/>
+            </wp:cNvGraphicFramePr>
+            <a:graphic xmlns:a="http://schemas.openxmlformats.org/drawingml/2006/main">
+              <a:graphicData uri="http://schemas.openxmlformats.org/drawingml/2006/picture">
+                <pic:pic xmlns:pic="http://schemas.openxmlformats.org/drawingml/2006/picture">
+                  <pic:nvPicPr>
+                    <pic:cNvPr id="1" name=""/>
+                    <pic:cNvPicPr/>
+                  </pic:nvPicPr>
+                  <pic:blipFill>
+                    <a:blip r:embed="rId124"/>
+                    <a:stretch>
+                      <a:fillRect/>
+                    </a:stretch>
+                  </pic:blipFill>
+                  <pic:spPr>
+                    <a:xfrm>
+                      <a:off x="0" y="0"/>
+                      <a:ext cx="2257740" cy="981212"/>
+                    </a:xfrm>
+                    <a:prstGeom prst="rect">
+                      <a:avLst/>
+                    </a:prstGeom>
+                  </pic:spPr>
+                </pic:pic>
+              </a:graphicData>
+            </a:graphic>
+          </wp:inline>
+        </w:drawing>
+      </w:r>
+    </w:p>
+    <w:p>
+      <w:pPr>
+        <w:pStyle w:val="PargrafodaLista"/>
+        <w:tabs>
+          <w:tab w:val="left" w:pos="1275"/>
+        </w:tabs>
+        <w:rPr>
+          <w:sz w:val="24"/>
+          <w:szCs w:val="24"/>
+        </w:rPr>
+      </w:pPr>
+    </w:p>
+    <w:p>
+      <w:pPr>
+        <w:pStyle w:val="PargrafodaLista"/>
+        <w:tabs>
+          <w:tab w:val="left" w:pos="1275"/>
+        </w:tabs>
+        <w:rPr>
+          <w:sz w:val="24"/>
+          <w:szCs w:val="24"/>
+        </w:rPr>
+      </w:pPr>
+      <w:r>
+        <w:rPr>
+          <w:sz w:val="24"/>
+          <w:szCs w:val="24"/>
+        </w:rPr>
+        <w:t xml:space="preserve">82 – Para trabalhar com a lista e a imagem benefícios criamos uma </w:t>
+      </w:r>
+      <w:proofErr w:type="spellStart"/>
+      <w:r>
+        <w:rPr>
+          <w:sz w:val="24"/>
+          <w:szCs w:val="24"/>
+        </w:rPr>
+        <w:t>div</w:t>
+      </w:r>
+      <w:proofErr w:type="spellEnd"/>
+      <w:r>
+        <w:rPr>
+          <w:sz w:val="24"/>
+          <w:szCs w:val="24"/>
+        </w:rPr>
+        <w:t xml:space="preserve"> para envolvê-los</w:t>
+      </w:r>
+      <w:r>
+        <w:rPr>
+          <w:sz w:val="24"/>
+          <w:szCs w:val="24"/>
+        </w:rPr>
+        <w:t xml:space="preserve"> conforme código e na lista adicionamos um</w:t>
+      </w:r>
+      <w:r>
+        <w:rPr>
+          <w:sz w:val="24"/>
+          <w:szCs w:val="24"/>
+        </w:rPr>
+        <w:t>a</w:t>
+      </w:r>
+      <w:r>
+        <w:rPr>
+          <w:sz w:val="24"/>
+          <w:szCs w:val="24"/>
+        </w:rPr>
+        <w:t xml:space="preserve"> </w:t>
+      </w:r>
+      <w:proofErr w:type="spellStart"/>
+      <w:r>
+        <w:rPr>
+          <w:sz w:val="24"/>
+          <w:szCs w:val="24"/>
+        </w:rPr>
+        <w:t>class</w:t>
+      </w:r>
+      <w:proofErr w:type="spellEnd"/>
+      <w:r>
+        <w:rPr>
+          <w:sz w:val="24"/>
+          <w:szCs w:val="24"/>
+        </w:rPr>
+        <w:t xml:space="preserve"> chamada lista-benefícios.</w:t>
+      </w:r>
+    </w:p>
+    <w:p>
+      <w:pPr>
+        <w:pStyle w:val="PargrafodaLista"/>
+        <w:tabs>
+          <w:tab w:val="left" w:pos="1275"/>
+        </w:tabs>
+        <w:rPr>
+          <w:sz w:val="24"/>
+          <w:szCs w:val="24"/>
+        </w:rPr>
+      </w:pPr>
+    </w:p>
+    <w:p>
+      <w:pPr>
+        <w:pStyle w:val="PargrafodaLista"/>
+        <w:tabs>
+          <w:tab w:val="left" w:pos="1275"/>
+        </w:tabs>
+        <w:rPr>
+          <w:sz w:val="24"/>
+          <w:szCs w:val="24"/>
+        </w:rPr>
+      </w:pPr>
+      <w:r>
+        <w:rPr>
+          <w:noProof/>
+          <w:sz w:val="24"/>
+          <w:szCs w:val="24"/>
+        </w:rPr>
+        <w:drawing>
+          <wp:inline distT="0" distB="0" distL="0" distR="0" wp14:anchorId="4C50D526" wp14:editId="64F182BE">
+            <wp:extent cx="5400040" cy="1810385"/>
+            <wp:effectExtent l="0" t="0" r="0" b="0"/>
+            <wp:docPr id="155" name="Imagem 155"/>
+            <wp:cNvGraphicFramePr>
+              <a:graphicFrameLocks xmlns:a="http://schemas.openxmlformats.org/drawingml/2006/main" noChangeAspect="1"/>
+            </wp:cNvGraphicFramePr>
+            <a:graphic xmlns:a="http://schemas.openxmlformats.org/drawingml/2006/main">
+              <a:graphicData uri="http://schemas.openxmlformats.org/drawingml/2006/picture">
+                <pic:pic xmlns:pic="http://schemas.openxmlformats.org/drawingml/2006/picture">
+                  <pic:nvPicPr>
+                    <pic:cNvPr id="1" name=""/>
+                    <pic:cNvPicPr/>
+                  </pic:nvPicPr>
+                  <pic:blipFill>
+                    <a:blip r:embed="rId125"/>
+                    <a:stretch>
+                      <a:fillRect/>
+                    </a:stretch>
+                  </pic:blipFill>
+                  <pic:spPr>
+                    <a:xfrm>
+                      <a:off x="0" y="0"/>
+                      <a:ext cx="5400040" cy="1810385"/>
+                    </a:xfrm>
+                    <a:prstGeom prst="rect">
+                      <a:avLst/>
+                    </a:prstGeom>
+                  </pic:spPr>
+                </pic:pic>
+              </a:graphicData>
+            </a:graphic>
+          </wp:inline>
+        </w:drawing>
+      </w:r>
+    </w:p>
+    <w:p>
+      <w:pPr>
+        <w:pStyle w:val="PargrafodaLista"/>
+        <w:tabs>
+          <w:tab w:val="left" w:pos="1275"/>
+        </w:tabs>
+        <w:rPr>
+          <w:sz w:val="24"/>
+          <w:szCs w:val="24"/>
+        </w:rPr>
+      </w:pPr>
+    </w:p>
+    <w:p>
+      <w:pPr>
+        <w:pStyle w:val="PargrafodaLista"/>
+        <w:tabs>
+          <w:tab w:val="left" w:pos="1275"/>
+        </w:tabs>
+        <w:rPr>
+          <w:sz w:val="24"/>
+          <w:szCs w:val="24"/>
+        </w:rPr>
+      </w:pPr>
+    </w:p>
+    <w:p>
+      <w:pPr>
+        <w:pStyle w:val="PargrafodaLista"/>
+        <w:tabs>
+          <w:tab w:val="left" w:pos="1275"/>
+        </w:tabs>
+        <w:rPr>
+          <w:sz w:val="24"/>
+          <w:szCs w:val="24"/>
+        </w:rPr>
+      </w:pPr>
+    </w:p>
+    <w:p>
+      <w:pPr>
+        <w:pStyle w:val="PargrafodaLista"/>
+        <w:tabs>
+          <w:tab w:val="left" w:pos="1275"/>
+        </w:tabs>
+        <w:rPr>
+          <w:sz w:val="24"/>
+          <w:szCs w:val="24"/>
+        </w:rPr>
+      </w:pPr>
+    </w:p>
+    <w:p>
+      <w:pPr>
+        <w:pStyle w:val="PargrafodaLista"/>
+        <w:tabs>
+          <w:tab w:val="left" w:pos="1275"/>
+        </w:tabs>
+        <w:rPr>
+          <w:sz w:val="24"/>
+          <w:szCs w:val="24"/>
+        </w:rPr>
+      </w:pPr>
+    </w:p>
+    <w:p>
+      <w:pPr>
+        <w:pStyle w:val="PargrafodaLista"/>
+        <w:tabs>
+          <w:tab w:val="left" w:pos="1275"/>
+        </w:tabs>
+        <w:rPr>
+          <w:sz w:val="24"/>
+          <w:szCs w:val="24"/>
+        </w:rPr>
+      </w:pPr>
+    </w:p>
+    <w:p>
+      <w:pPr>
+        <w:pStyle w:val="PargrafodaLista"/>
+        <w:tabs>
+          <w:tab w:val="left" w:pos="1275"/>
+        </w:tabs>
+        <w:rPr>
+          <w:sz w:val="24"/>
+          <w:szCs w:val="24"/>
+        </w:rPr>
+      </w:pPr>
+    </w:p>
+    <w:p>
+      <w:pPr>
+        <w:pStyle w:val="PargrafodaLista"/>
+        <w:tabs>
+          <w:tab w:val="left" w:pos="1275"/>
+        </w:tabs>
+        <w:rPr>
+          <w:sz w:val="24"/>
+          <w:szCs w:val="24"/>
+        </w:rPr>
+      </w:pPr>
+      <w:r>
+        <w:rPr>
+          <w:sz w:val="24"/>
+          <w:szCs w:val="24"/>
+        </w:rPr>
+        <w:lastRenderedPageBreak/>
+        <w:t xml:space="preserve">83 – No CSS </w:t>
+      </w:r>
+      <w:r>
+        <w:rPr>
+          <w:sz w:val="24"/>
+          <w:szCs w:val="24"/>
+        </w:rPr>
+        <w:t xml:space="preserve">demos uma largura para </w:t>
+      </w:r>
+      <w:proofErr w:type="spellStart"/>
+      <w:r>
+        <w:rPr>
+          <w:sz w:val="24"/>
+          <w:szCs w:val="24"/>
+        </w:rPr>
+        <w:t>div</w:t>
+      </w:r>
+      <w:proofErr w:type="spellEnd"/>
+      <w:r>
+        <w:rPr>
+          <w:sz w:val="24"/>
+          <w:szCs w:val="24"/>
+        </w:rPr>
+        <w:t xml:space="preserve"> </w:t>
+      </w:r>
+      <w:proofErr w:type="spellStart"/>
+      <w:r>
+        <w:rPr>
+          <w:sz w:val="24"/>
+          <w:szCs w:val="24"/>
+        </w:rPr>
+        <w:t>conteudo-beneficios</w:t>
+      </w:r>
+      <w:proofErr w:type="spellEnd"/>
+      <w:r>
+        <w:rPr>
+          <w:sz w:val="24"/>
+          <w:szCs w:val="24"/>
+        </w:rPr>
+        <w:t xml:space="preserve"> e centralizamos o conteúdo usando </w:t>
+      </w:r>
+      <w:proofErr w:type="spellStart"/>
+      <w:r>
+        <w:rPr>
+          <w:sz w:val="24"/>
+          <w:szCs w:val="24"/>
+        </w:rPr>
+        <w:t>margin</w:t>
+      </w:r>
+      <w:proofErr w:type="spellEnd"/>
+      <w:r>
+        <w:rPr>
+          <w:sz w:val="24"/>
+          <w:szCs w:val="24"/>
+        </w:rPr>
+        <w:t xml:space="preserve"> 0 auto. </w:t>
+      </w:r>
+    </w:p>
+    <w:p>
+      <w:pPr>
+        <w:pStyle w:val="PargrafodaLista"/>
+        <w:tabs>
+          <w:tab w:val="left" w:pos="1275"/>
+        </w:tabs>
+        <w:rPr>
+          <w:sz w:val="24"/>
+          <w:szCs w:val="24"/>
+        </w:rPr>
+      </w:pPr>
+    </w:p>
+    <w:p>
+      <w:pPr>
+        <w:pStyle w:val="PargrafodaLista"/>
+        <w:tabs>
+          <w:tab w:val="left" w:pos="1275"/>
+        </w:tabs>
+        <w:rPr>
+          <w:sz w:val="24"/>
+          <w:szCs w:val="24"/>
+        </w:rPr>
+      </w:pPr>
+      <w:r>
+        <w:rPr>
+          <w:noProof/>
+          <w:sz w:val="24"/>
+          <w:szCs w:val="24"/>
+        </w:rPr>
+        <w:drawing>
+          <wp:inline distT="0" distB="0" distL="0" distR="0" wp14:anchorId="73864A0D" wp14:editId="3412B713">
+            <wp:extent cx="2305372" cy="1143160"/>
+            <wp:effectExtent l="0" t="0" r="0" b="0"/>
+            <wp:docPr id="156" name="Imagem 156"/>
+            <wp:cNvGraphicFramePr>
+              <a:graphicFrameLocks xmlns:a="http://schemas.openxmlformats.org/drawingml/2006/main" noChangeAspect="1"/>
+            </wp:cNvGraphicFramePr>
+            <a:graphic xmlns:a="http://schemas.openxmlformats.org/drawingml/2006/main">
+              <a:graphicData uri="http://schemas.openxmlformats.org/drawingml/2006/picture">
+                <pic:pic xmlns:pic="http://schemas.openxmlformats.org/drawingml/2006/picture">
+                  <pic:nvPicPr>
+                    <pic:cNvPr id="1" name=""/>
+                    <pic:cNvPicPr/>
+                  </pic:nvPicPr>
+                  <pic:blipFill>
+                    <a:blip r:embed="rId126"/>
+                    <a:stretch>
+                      <a:fillRect/>
+                    </a:stretch>
+                  </pic:blipFill>
+                  <pic:spPr>
+                    <a:xfrm>
+                      <a:off x="0" y="0"/>
+                      <a:ext cx="2305372" cy="1143160"/>
+                    </a:xfrm>
+                    <a:prstGeom prst="rect">
+                      <a:avLst/>
+                    </a:prstGeom>
+                  </pic:spPr>
+                </pic:pic>
+              </a:graphicData>
+            </a:graphic>
+          </wp:inline>
+        </w:drawing>
+      </w:r>
+    </w:p>
+    <w:p>
+      <w:pPr>
+        <w:pStyle w:val="PargrafodaLista"/>
+        <w:tabs>
+          <w:tab w:val="left" w:pos="1275"/>
+        </w:tabs>
+        <w:rPr>
+          <w:sz w:val="24"/>
+          <w:szCs w:val="24"/>
+        </w:rPr>
+      </w:pPr>
+    </w:p>
+    <w:p>
+      <w:pPr>
+        <w:pStyle w:val="PargrafodaLista"/>
+        <w:tabs>
+          <w:tab w:val="left" w:pos="1275"/>
+        </w:tabs>
+        <w:rPr>
+          <w:sz w:val="24"/>
+          <w:szCs w:val="24"/>
+        </w:rPr>
+      </w:pPr>
+      <w:r>
+        <w:rPr>
+          <w:sz w:val="24"/>
+          <w:szCs w:val="24"/>
+        </w:rPr>
+        <w:t>84- E na lista-</w:t>
+      </w:r>
+      <w:r>
+        <w:rPr>
+          <w:sz w:val="24"/>
+          <w:szCs w:val="24"/>
+        </w:rPr>
+        <w:t>benefícios demos uma largura de 40% para ficar ao lado da imagem.</w:t>
+      </w:r>
+    </w:p>
+    <w:p>
+      <w:pPr>
+        <w:pStyle w:val="PargrafodaLista"/>
+        <w:tabs>
+          <w:tab w:val="left" w:pos="1275"/>
+        </w:tabs>
+        <w:rPr>
+          <w:sz w:val="24"/>
+          <w:szCs w:val="24"/>
+        </w:rPr>
+      </w:pPr>
+    </w:p>
+    <w:p>
+      <w:pPr>
+        <w:pStyle w:val="PargrafodaLista"/>
+        <w:tabs>
+          <w:tab w:val="left" w:pos="1275"/>
+        </w:tabs>
+        <w:rPr>
+          <w:sz w:val="24"/>
+          <w:szCs w:val="24"/>
+        </w:rPr>
+      </w:pPr>
+      <w:r>
+        <w:rPr>
+          <w:noProof/>
+          <w:sz w:val="24"/>
+          <w:szCs w:val="24"/>
+        </w:rPr>
+        <w:drawing>
+          <wp:inline distT="0" distB="0" distL="0" distR="0" wp14:anchorId="4249E5E7" wp14:editId="1AC17CBA">
+            <wp:extent cx="2162477" cy="1105054"/>
+            <wp:effectExtent l="0" t="0" r="9525" b="0"/>
+            <wp:docPr id="157" name="Imagem 157"/>
+            <wp:cNvGraphicFramePr>
+              <a:graphicFrameLocks xmlns:a="http://schemas.openxmlformats.org/drawingml/2006/main" noChangeAspect="1"/>
+            </wp:cNvGraphicFramePr>
+            <a:graphic xmlns:a="http://schemas.openxmlformats.org/drawingml/2006/main">
+              <a:graphicData uri="http://schemas.openxmlformats.org/drawingml/2006/picture">
+                <pic:pic xmlns:pic="http://schemas.openxmlformats.org/drawingml/2006/picture">
+                  <pic:nvPicPr>
+                    <pic:cNvPr id="1" name=""/>
+                    <pic:cNvPicPr/>
+                  </pic:nvPicPr>
+                  <pic:blipFill>
+                    <a:blip r:embed="rId127"/>
+                    <a:stretch>
+                      <a:fillRect/>
+                    </a:stretch>
+                  </pic:blipFill>
+                  <pic:spPr>
+                    <a:xfrm>
+                      <a:off x="0" y="0"/>
+                      <a:ext cx="2162477" cy="1105054"/>
+                    </a:xfrm>
+                    <a:prstGeom prst="rect">
+                      <a:avLst/>
+                    </a:prstGeom>
+                  </pic:spPr>
+                </pic:pic>
+              </a:graphicData>
+            </a:graphic>
+          </wp:inline>
+        </w:drawing>
+      </w:r>
+    </w:p>
+    <w:p>
+      <w:pPr>
+        <w:pStyle w:val="PargrafodaLista"/>
+        <w:tabs>
+          <w:tab w:val="left" w:pos="1275"/>
+        </w:tabs>
+        <w:rPr>
+          <w:sz w:val="24"/>
+          <w:szCs w:val="24"/>
+        </w:rPr>
+      </w:pPr>
+    </w:p>
+    <w:p>
+      <w:pPr>
+        <w:pStyle w:val="PargrafodaLista"/>
+        <w:tabs>
+          <w:tab w:val="left" w:pos="1275"/>
+        </w:tabs>
+        <w:rPr>
+          <w:sz w:val="24"/>
+          <w:szCs w:val="24"/>
+        </w:rPr>
+      </w:pPr>
+      <w:r>
+        <w:rPr>
+          <w:sz w:val="24"/>
+          <w:szCs w:val="24"/>
+        </w:rPr>
+        <w:t xml:space="preserve">85 – Para colocar a imagem ao lado da lista </w:t>
+      </w:r>
+      <w:r>
+        <w:rPr>
+          <w:sz w:val="24"/>
+          <w:szCs w:val="24"/>
+        </w:rPr>
+        <w:t xml:space="preserve">colocamos display: </w:t>
+      </w:r>
+      <w:proofErr w:type="spellStart"/>
+      <w:r>
+        <w:rPr>
+          <w:sz w:val="24"/>
+          <w:szCs w:val="24"/>
+        </w:rPr>
+        <w:t>inline-block</w:t>
+      </w:r>
+      <w:proofErr w:type="spellEnd"/>
+      <w:r>
+        <w:rPr>
+          <w:sz w:val="24"/>
+          <w:szCs w:val="24"/>
+        </w:rPr>
+        <w:t xml:space="preserve"> na lista e observamos mesmo assim a lista não ficou ao lado da imagem e nessa situação quando temos uma lista que ocupa 40% e uma imagem que ocupa 60%</w:t>
+      </w:r>
+      <w:r>
+        <w:rPr>
+          <w:sz w:val="24"/>
+          <w:szCs w:val="24"/>
+        </w:rPr>
+        <w:t xml:space="preserve">  o código no </w:t>
+      </w:r>
+      <w:proofErr w:type="spellStart"/>
+      <w:r>
+        <w:rPr>
+          <w:sz w:val="24"/>
+          <w:szCs w:val="24"/>
+        </w:rPr>
+        <w:t>html</w:t>
+      </w:r>
+      <w:proofErr w:type="spellEnd"/>
+      <w:r>
+        <w:rPr>
+          <w:sz w:val="24"/>
+          <w:szCs w:val="24"/>
+        </w:rPr>
+        <w:t xml:space="preserve"> conta precisamos colocar um ao lado do outro conforme código.</w:t>
+      </w:r>
+    </w:p>
+    <w:p>
+      <w:pPr>
+        <w:pStyle w:val="PargrafodaLista"/>
+        <w:tabs>
+          <w:tab w:val="left" w:pos="1275"/>
+        </w:tabs>
+        <w:rPr>
+          <w:sz w:val="24"/>
+          <w:szCs w:val="24"/>
+        </w:rPr>
+      </w:pPr>
+      <w:r>
+        <w:rPr>
+          <w:noProof/>
+          <w:sz w:val="24"/>
+          <w:szCs w:val="24"/>
+        </w:rPr>
+        <mc:AlternateContent>
+          <mc:Choice Requires="wps">
+            <w:drawing>
+              <wp:anchor distT="0" distB="0" distL="114300" distR="114300" simplePos="0" relativeHeight="251700224" behindDoc="0" locked="0" layoutInCell="1" allowOverlap="1">
+                <wp:simplePos x="0" y="0"/>
+                <wp:positionH relativeFrom="column">
+                  <wp:posOffset>1136371</wp:posOffset>
+                </wp:positionH>
+                <wp:positionV relativeFrom="paragraph">
+                  <wp:posOffset>101982</wp:posOffset>
+                </wp:positionV>
+                <wp:extent cx="4719370" cy="1002182"/>
+                <wp:effectExtent l="38100" t="0" r="24130" b="83820"/>
+                <wp:wrapNone/>
+                <wp:docPr id="159" name="Conector de Seta Reta 159"/>
+                <wp:cNvGraphicFramePr/>
+                <a:graphic xmlns:a="http://schemas.openxmlformats.org/drawingml/2006/main">
+                  <a:graphicData uri="http://schemas.microsoft.com/office/word/2010/wordprocessingShape">
+                    <wps:wsp>
+                      <wps:cNvCnPr/>
+                      <wps:spPr>
+                        <a:xfrm flipH="1">
+                          <a:off x="0" y="0"/>
+                          <a:ext cx="4719370" cy="1002182"/>
+                        </a:xfrm>
+                        <a:prstGeom prst="straightConnector1">
+                          <a:avLst/>
+                        </a:prstGeom>
+                        <a:ln>
+                          <a:tailEnd type="triangle"/>
+                        </a:ln>
+                      </wps:spPr>
+                      <wps:style>
+                        <a:lnRef idx="1">
+                          <a:schemeClr val="accent1"/>
+                        </a:lnRef>
+                        <a:fillRef idx="0">
+                          <a:schemeClr val="accent1"/>
+                        </a:fillRef>
+                        <a:effectRef idx="0">
+                          <a:schemeClr val="accent1"/>
+                        </a:effectRef>
+                        <a:fontRef idx="minor">
+                          <a:schemeClr val="tx1"/>
+                        </a:fontRef>
+                      </wps:style>
+                      <wps:bodyPr/>
+                    </wps:wsp>
+                  </a:graphicData>
+                </a:graphic>
+                <wp14:sizeRelH relativeFrom="margin">
+                  <wp14:pctWidth>0</wp14:pctWidth>
+                </wp14:sizeRelH>
+                <wp14:sizeRelV relativeFrom="margin">
+                  <wp14:pctHeight>0</wp14:pctHeight>
+                </wp14:sizeRelV>
+              </wp:anchor>
+            </w:drawing>
+          </mc:Choice>
+          <mc:Fallback>
+            <w:pict>
+              <v:shapetype w14:anchorId="6CF8D2D0" id="_x0000_t32" coordsize="21600,21600" o:spt="32" o:oned="t" path="m,l21600,21600e" filled="f">
+                <v:path arrowok="t" fillok="f" o:connecttype="none"/>
+                <o:lock v:ext="edit" shapetype="t"/>
+              </v:shapetype>
+              <v:shape id="Conector de Seta Reta 159" o:spid="_x0000_s1026" type="#_x0000_t32" style="position:absolute;margin-left:89.5pt;margin-top:8.05pt;width:371.6pt;height:78.9pt;flip:x;z-index:251700224;visibility:visible;mso-wrap-style:square;mso-width-percent:0;mso-height-percent:0;mso-wrap-distance-left:9pt;mso-wrap-distance-top:0;mso-wrap-distance-right:9pt;mso-wrap-distance-bottom:0;mso-position-horizontal:absolute;mso-position-horizontal-relative:text;mso-position-vertical:absolute;mso-position-vertical-relative:text;mso-width-percent:0;mso-height-percent:0;mso-width-relative:margin;mso-height-relative:margin" o:gfxdata="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" strokecolor="#4472c4 [3204]" strokeweight=".5pt">
+                <v:stroke endarrow="block" joinstyle="miter"/>
+              </v:shape>
+            </w:pict>
+          </mc:Fallback>
+        </mc:AlternateContent>
+      </w:r>
+      <w:r>
+        <w:rPr>
+          <w:noProof/>
+          <w:sz w:val="24"/>
+          <w:szCs w:val="24"/>
+        </w:rPr>
+        <w:drawing>
+          <wp:inline distT="0" distB="0" distL="0" distR="0" wp14:anchorId="6787A9A2" wp14:editId="78E1BD5D">
+            <wp:extent cx="5400040" cy="1435100"/>
+            <wp:effectExtent l="0" t="0" r="0" b="0"/>
+            <wp:docPr id="158" name="Imagem 158"/>
+            <wp:cNvGraphicFramePr>
+              <a:graphicFrameLocks xmlns:a="http://schemas.openxmlformats.org/drawingml/2006/main" noChangeAspect="1"/>
+            </wp:cNvGraphicFramePr>
+            <a:graphic xmlns:a="http://schemas.openxmlformats.org/drawingml/2006/main">
+              <a:graphicData uri="http://schemas.openxmlformats.org/drawingml/2006/picture">
+                <pic:pic xmlns:pic="http://schemas.openxmlformats.org/drawingml/2006/picture">
+                  <pic:nvPicPr>
+                    <pic:cNvPr id="1" name=""/>
+                    <pic:cNvPicPr/>
+                  </pic:nvPicPr>
+                  <pic:blipFill>
+                    <a:blip r:embed="rId128"/>
+                    <a:stretch>
+                      <a:fillRect/>
+                    </a:stretch>
+                  </pic:blipFill>
+                  <pic:spPr>
+                    <a:xfrm>
+                      <a:off x="0" y="0"/>
+                      <a:ext cx="5400040" cy="1435100"/>
+                    </a:xfrm>
+                    <a:prstGeom prst="rect">
+                      <a:avLst/>
+                    </a:prstGeom>
+                  </pic:spPr>
+                </pic:pic>
+              </a:graphicData>
+            </a:graphic>
+          </wp:inline>
+        </w:drawing>
+      </w:r>
+    </w:p>
+    <w:p>
+      <w:pPr>
+        <w:pStyle w:val="PargrafodaLista"/>
+        <w:tabs>
+          <w:tab w:val="left" w:pos="1275"/>
+        </w:tabs>
+        <w:rPr>
+          <w:sz w:val="24"/>
+          <w:szCs w:val="24"/>
+        </w:rPr>
+      </w:pPr>
+      <w:r>
+        <w:rPr>
+          <w:noProof/>
+          <w:sz w:val="24"/>
+          <w:szCs w:val="24"/>
+        </w:rPr>
+        <w:drawing>
+          <wp:inline distT="0" distB="0" distL="0" distR="0" wp14:anchorId="707F12D8" wp14:editId="5602E692">
+            <wp:extent cx="3248478" cy="1724266"/>
+            <wp:effectExtent l="0" t="0" r="0" b="9525"/>
+            <wp:docPr id="160" name="Imagem 160"/>
+            <wp:cNvGraphicFramePr>
+              <a:graphicFrameLocks xmlns:a="http://schemas.openxmlformats.org/drawingml/2006/main" noChangeAspect="1"/>
+            </wp:cNvGraphicFramePr>
+            <a:graphic xmlns:a="http://schemas.openxmlformats.org/drawingml/2006/main">
+              <a:graphicData uri="http://schemas.openxmlformats.org/drawingml/2006/picture">
+                <pic:pic xmlns:pic="http://schemas.openxmlformats.org/drawingml/2006/picture">
+                  <pic:nvPicPr>
+                    <pic:cNvPr id="1" name=""/>
+                    <pic:cNvPicPr/>
+                  </pic:nvPicPr>
+                  <pic:blipFill>
+                    <a:blip r:embed="rId129"/>
+                    <a:stretch>
+                      <a:fillRect/>
+                    </a:stretch>
+                  </pic:blipFill>
+                  <pic:spPr>
+                    <a:xfrm>
+                      <a:off x="0" y="0"/>
+                      <a:ext cx="3248478" cy="1724266"/>
+                    </a:xfrm>
+                    <a:prstGeom prst="rect">
+                      <a:avLst/>
+                    </a:prstGeom>
+                  </pic:spPr>
+                </pic:pic>
+              </a:graphicData>
+            </a:graphic>
+          </wp:inline>
+        </w:drawing>
+      </w:r>
+    </w:p>
+    <w:p>
+      <w:pPr>
+        <w:pStyle w:val="PargrafodaLista"/>
+        <w:tabs>
+          <w:tab w:val="left" w:pos="1275"/>
+        </w:tabs>
+        <w:rPr>
+          <w:sz w:val="24"/>
+          <w:szCs w:val="24"/>
+        </w:rPr>
+      </w:pPr>
+      <w:r>
+        <w:rPr>
+          <w:sz w:val="24"/>
+          <w:szCs w:val="24"/>
+        </w:rPr>
+        <w:t xml:space="preserve"> </w:t>
+      </w:r>
+    </w:p>
+    <w:p>
+      <w:pPr>
+        <w:pStyle w:val="PargrafodaLista"/>
+        <w:tabs>
+          <w:tab w:val="left" w:pos="1275"/>
+        </w:tabs>
+        <w:rPr>
+          <w:sz w:val="24"/>
+          <w:szCs w:val="24"/>
+        </w:rPr>
+      </w:pPr>
+      <w:r>
+        <w:rPr>
+          <w:sz w:val="24"/>
+          <w:szCs w:val="24"/>
+        </w:rPr>
+        <w:t xml:space="preserve"> </w:t>
+      </w:r>
+    </w:p>
+    <w:p>
+      <w:pPr>
+        <w:pStyle w:val="PargrafodaLista"/>
+        <w:tabs>
+          <w:tab w:val="left" w:pos="1275"/>
+        </w:tabs>
+        <w:rPr>
+          <w:sz w:val="24"/>
+          <w:szCs w:val="24"/>
+        </w:rPr>
+      </w:pPr>
+    </w:p>
+    <w:p>
+      <w:pPr>
+        <w:pStyle w:val="PargrafodaLista"/>
+        <w:tabs>
+          <w:tab w:val="left" w:pos="1275"/>
+        </w:tabs>
+        <w:rPr>
+          <w:sz w:val="24"/>
+          <w:szCs w:val="24"/>
+        </w:rPr>
+      </w:pPr>
+    </w:p>
+    <w:p>
+      <w:pPr>
+        <w:pStyle w:val="PargrafodaLista"/>
+        <w:tabs>
+          <w:tab w:val="left" w:pos="1275"/>
+        </w:tabs>
+        <w:rPr>
+          <w:sz w:val="24"/>
+          <w:szCs w:val="24"/>
+        </w:rPr>
+      </w:pPr>
+      <w:r>
+        <w:rPr>
+          <w:sz w:val="24"/>
+          <w:szCs w:val="24"/>
+        </w:rPr>
+        <w:lastRenderedPageBreak/>
+        <w:t>86</w:t>
+      </w:r>
+      <w:r>
+        <w:rPr>
+          <w:sz w:val="24"/>
+          <w:szCs w:val="24"/>
+        </w:rPr>
+        <w:t>-</w:t>
+      </w:r>
+      <w:r>
+        <w:rPr>
+          <w:sz w:val="24"/>
+          <w:szCs w:val="24"/>
+        </w:rPr>
+        <w:t xml:space="preserve"> </w:t>
+      </w:r>
+      <w:r>
+        <w:rPr>
+          <w:sz w:val="24"/>
+          <w:szCs w:val="24"/>
+        </w:rPr>
+        <w:t xml:space="preserve">Adicionamos mais dois itens a lista e demos um espaço entre os itens dela no </w:t>
+      </w:r>
+      <w:proofErr w:type="spellStart"/>
+      <w:r>
+        <w:rPr>
+          <w:sz w:val="24"/>
+          <w:szCs w:val="24"/>
+        </w:rPr>
+        <w:t>css</w:t>
+      </w:r>
+      <w:proofErr w:type="spellEnd"/>
+      <w:r>
+        <w:rPr>
+          <w:sz w:val="24"/>
+          <w:szCs w:val="24"/>
+        </w:rPr>
+        <w:t>.</w:t>
+      </w:r>
+    </w:p>
+    <w:p>
+      <w:pPr>
+        <w:pStyle w:val="PargrafodaLista"/>
+        <w:tabs>
+          <w:tab w:val="left" w:pos="1275"/>
+        </w:tabs>
+        <w:rPr>
+          <w:sz w:val="24"/>
+          <w:szCs w:val="24"/>
+        </w:rPr>
+      </w:pPr>
+      <w:r>
+        <w:rPr>
+          <w:noProof/>
+          <w:sz w:val="24"/>
+          <w:szCs w:val="24"/>
+        </w:rPr>
+        <mc:AlternateContent>
+          <mc:Choice Requires="wps">
+            <w:drawing>
+              <wp:anchor distT="0" distB="0" distL="114300" distR="114300" simplePos="0" relativeHeight="251702272" behindDoc="0" locked="0" layoutInCell="1" allowOverlap="1">
+                <wp:simplePos x="0" y="0"/>
+                <wp:positionH relativeFrom="column">
+                  <wp:posOffset>3382137</wp:posOffset>
+                </wp:positionH>
+                <wp:positionV relativeFrom="paragraph">
+                  <wp:posOffset>1112901</wp:posOffset>
+                </wp:positionV>
+                <wp:extent cx="2141855" cy="131674"/>
+                <wp:effectExtent l="38100" t="0" r="10795" b="97155"/>
+                <wp:wrapNone/>
+                <wp:docPr id="163" name="Conector de Seta Reta 163"/>
+                <wp:cNvGraphicFramePr/>
+                <a:graphic xmlns:a="http://schemas.openxmlformats.org/drawingml/2006/main">
+                  <a:graphicData uri="http://schemas.microsoft.com/office/word/2010/wordprocessingShape">
+                    <wps:wsp>
+                      <wps:cNvCnPr/>
+                      <wps:spPr>
+                        <a:xfrm flipH="1">
+                          <a:off x="0" y="0"/>
+                          <a:ext cx="2141855" cy="131674"/>
+                        </a:xfrm>
+                        <a:prstGeom prst="straightConnector1">
+                          <a:avLst/>
+                        </a:prstGeom>
+                        <a:ln>
+                          <a:tailEnd type="triangle"/>
+                        </a:ln>
+                      </wps:spPr>
+                      <wps:style>
+                        <a:lnRef idx="1">
+                          <a:schemeClr val="accent1"/>
+                        </a:lnRef>
+                        <a:fillRef idx="0">
+                          <a:schemeClr val="accent1"/>
+                        </a:fillRef>
+                        <a:effectRef idx="0">
+                          <a:schemeClr val="accent1"/>
+                        </a:effectRef>
+                        <a:fontRef idx="minor">
+                          <a:schemeClr val="tx1"/>
+                        </a:fontRef>
+                      </wps:style>
+                      <wps:bodyPr/>
+                    </wps:wsp>
+                  </a:graphicData>
+                </a:graphic>
+              </wp:anchor>
+            </w:drawing>
+          </mc:Choice>
+          <mc:Fallback>
+            <w:pict>
+              <v:shape w14:anchorId="32532852" id="Conector de Seta Reta 163" o:spid="_x0000_s1026" type="#_x0000_t32" style="position:absolute;margin-left:266.3pt;margin-top:87.65pt;width:168.65pt;height:10.35pt;flip:x;z-index:251702272;visibility:visible;mso-wrap-style:square;mso-wrap-distance-left:9pt;mso-wrap-distance-top:0;mso-wrap-distance-right:9pt;mso-wrap-distance-bottom:0;mso-position-horizontal:absolute;mso-position-horizontal-relative:text;mso-position-vertical:absolute;mso-position-vertical-relative:text" o:gfxdata="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" strokecolor="#4472c4 [3204]" strokeweight=".5pt">
+                <v:stroke endarrow="block" joinstyle="miter"/>
+              </v:shape>
+            </w:pict>
+          </mc:Fallback>
+        </mc:AlternateContent>
+      </w:r>
+      <w:r>
+        <w:rPr>
+          <w:noProof/>
+          <w:sz w:val="24"/>
+          <w:szCs w:val="24"/>
+        </w:rPr>
+        <mc:AlternateContent>
+          <mc:Choice Requires="wps">
+            <w:drawing>
+              <wp:anchor distT="0" distB="0" distL="114300" distR="114300" simplePos="0" relativeHeight="251701248" behindDoc="0" locked="0" layoutInCell="1" allowOverlap="1">
+                <wp:simplePos x="0" y="0"/>
+                <wp:positionH relativeFrom="column">
+                  <wp:posOffset>3945407</wp:posOffset>
+                </wp:positionH>
+                <wp:positionV relativeFrom="paragraph">
+                  <wp:posOffset>747141</wp:posOffset>
+                </wp:positionV>
+                <wp:extent cx="1536192" cy="270662"/>
+                <wp:effectExtent l="38100" t="0" r="26035" b="72390"/>
+                <wp:wrapNone/>
+                <wp:docPr id="162" name="Conector de Seta Reta 162"/>
+                <wp:cNvGraphicFramePr/>
+                <a:graphic xmlns:a="http://schemas.openxmlformats.org/drawingml/2006/main">
+                  <a:graphicData uri="http://schemas.microsoft.com/office/word/2010/wordprocessingShape">
+                    <wps:wsp>
+                      <wps:cNvCnPr/>
+                      <wps:spPr>
+                        <a:xfrm flipH="1">
+                          <a:off x="0" y="0"/>
+                          <a:ext cx="1536192" cy="270662"/>
+                        </a:xfrm>
+                        <a:prstGeom prst="straightConnector1">
+                          <a:avLst/>
+                        </a:prstGeom>
+                        <a:ln>
+                          <a:tailEnd type="triangle"/>
+                        </a:ln>
+                      </wps:spPr>
+                      <wps:style>
+                        <a:lnRef idx="1">
+                          <a:schemeClr val="accent1"/>
+                        </a:lnRef>
+                        <a:fillRef idx="0">
+                          <a:schemeClr val="accent1"/>
+                        </a:fillRef>
+                        <a:effectRef idx="0">
+                          <a:schemeClr val="accent1"/>
+                        </a:effectRef>
+                        <a:fontRef idx="minor">
+                          <a:schemeClr val="tx1"/>
+                        </a:fontRef>
+                      </wps:style>
+                      <wps:bodyPr/>
+                    </wps:wsp>
+                  </a:graphicData>
+                </a:graphic>
+              </wp:anchor>
+            </w:drawing>
+          </mc:Choice>
+          <mc:Fallback>
+            <w:pict>
+              <v:shape w14:anchorId="5C505F36" id="Conector de Seta Reta 162" o:spid="_x0000_s1026" type="#_x0000_t32" style="position:absolute;margin-left:310.65pt;margin-top:58.85pt;width:120.95pt;height:21.3pt;flip:x;z-index:251701248;visibility:visible;mso-wrap-style:square;mso-wrap-distance-left:9pt;mso-wrap-distance-top:0;mso-wrap-distance-right:9pt;mso-wrap-distance-bottom:0;mso-position-horizontal:absolute;mso-position-horizontal-relative:text;mso-position-vertical:absolute;mso-position-vertical-relative:text" o:gfxdata="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" strokecolor="#4472c4 [3204]" strokeweight=".5pt">
+                <v:stroke endarrow="block" joinstyle="miter"/>
+              </v:shape>
+            </w:pict>
+          </mc:Fallback>
+        </mc:AlternateContent>
+      </w:r>
+      <w:r>
+        <w:rPr>
+          <w:noProof/>
+          <w:sz w:val="24"/>
+          <w:szCs w:val="24"/>
+        </w:rPr>
+        <w:drawing>
+          <wp:inline distT="0" distB="0" distL="0" distR="0" wp14:anchorId="58F1615B" wp14:editId="4C4CD33C">
+            <wp:extent cx="5068007" cy="1428949"/>
+            <wp:effectExtent l="0" t="0" r="0" b="0"/>
+            <wp:docPr id="161" name="Imagem 161"/>
+            <wp:cNvGraphicFramePr>
+              <a:graphicFrameLocks xmlns:a="http://schemas.openxmlformats.org/drawingml/2006/main" noChangeAspect="1"/>
+            </wp:cNvGraphicFramePr>
+            <a:graphic xmlns:a="http://schemas.openxmlformats.org/drawingml/2006/main">
+              <a:graphicData uri="http://schemas.openxmlformats.org/drawingml/2006/picture">
+                <pic:pic xmlns:pic="http://schemas.openxmlformats.org/drawingml/2006/picture">
+                  <pic:nvPicPr>
+                    <pic:cNvPr id="1" name=""/>
+                    <pic:cNvPicPr/>
+                  </pic:nvPicPr>
+                  <pic:blipFill>
+                    <a:blip r:embed="rId130"/>
+                    <a:stretch>
+                      <a:fillRect/>
+                    </a:stretch>
+                  </pic:blipFill>
+                  <pic:spPr>
+                    <a:xfrm>
+                      <a:off x="0" y="0"/>
+                      <a:ext cx="5068007" cy="1428949"/>
+                    </a:xfrm>
+                    <a:prstGeom prst="rect">
+                      <a:avLst/>
+                    </a:prstGeom>
+                  </pic:spPr>
+                </pic:pic>
+              </a:graphicData>
+            </a:graphic>
+          </wp:inline>
+        </w:drawing>
+      </w:r>
+    </w:p>
+    <w:p>
+      <w:pPr>
+        <w:pStyle w:val="PargrafodaLista"/>
+        <w:tabs>
+          <w:tab w:val="left" w:pos="1275"/>
+        </w:tabs>
+        <w:rPr>
+          <w:sz w:val="24"/>
+          <w:szCs w:val="24"/>
+        </w:rPr>
+      </w:pPr>
+      <w:r>
+        <w:rPr>
+          <w:noProof/>
+          <w:sz w:val="24"/>
+          <w:szCs w:val="24"/>
+        </w:rPr>
+        <w:drawing>
+          <wp:inline distT="0" distB="0" distL="0" distR="0" wp14:anchorId="4781D1E3" wp14:editId="5D4A0A19">
+            <wp:extent cx="2476846" cy="943107"/>
+            <wp:effectExtent l="0" t="0" r="0" b="9525"/>
+            <wp:docPr id="164" name="Imagem 164"/>
+            <wp:cNvGraphicFramePr>
+              <a:graphicFrameLocks xmlns:a="http://schemas.openxmlformats.org/drawingml/2006/main" noChangeAspect="1"/>
+            </wp:cNvGraphicFramePr>
+            <a:graphic xmlns:a="http://schemas.openxmlformats.org/drawingml/2006/main">
+              <a:graphicData uri="http://schemas.openxmlformats.org/drawingml/2006/picture">
+                <pic:pic xmlns:pic="http://schemas.openxmlformats.org/drawingml/2006/picture">
+                  <pic:nvPicPr>
+                    <pic:cNvPr id="1" name=""/>
+                    <pic:cNvPicPr/>
+                  </pic:nvPicPr>
+                  <pic:blipFill>
+                    <a:blip r:embed="rId131"/>
+                    <a:stretch>
+                      <a:fillRect/>
+                    </a:stretch>
+                  </pic:blipFill>
+                  <pic:spPr>
+                    <a:xfrm>
+                      <a:off x="0" y="0"/>
+                      <a:ext cx="2476846" cy="943107"/>
+                    </a:xfrm>
+                    <a:prstGeom prst="rect">
+                      <a:avLst/>
+                    </a:prstGeom>
+                  </pic:spPr>
+                </pic:pic>
+              </a:graphicData>
+            </a:graphic>
+          </wp:inline>
+        </w:drawing>
+      </w:r>
+    </w:p>
+    <w:p>
+      <w:pPr>
+        <w:pStyle w:val="PargrafodaLista"/>
+        <w:tabs>
+          <w:tab w:val="left" w:pos="1275"/>
+        </w:tabs>
+        <w:rPr>
+          <w:sz w:val="24"/>
+          <w:szCs w:val="24"/>
+        </w:rPr>
+      </w:pPr>
+    </w:p>
+    <w:p>
+      <w:pPr>
+        <w:pStyle w:val="PargrafodaLista"/>
+        <w:tabs>
+          <w:tab w:val="left" w:pos="1275"/>
+        </w:tabs>
+        <w:rPr>
+          <w:sz w:val="24"/>
+          <w:szCs w:val="24"/>
+        </w:rPr>
+      </w:pPr>
       <w:bookmarkStart w:id="0" w:name="_GoBack"/>
       <w:bookmarkEnd w:id="0"/>
     </w:p>
@@ -18676,7 +20247,7 @@
 </file>
 
 <file path=customXml/itemProps1.xml><?xml version="1.0" encoding="utf-8"?>
-<ds:datastoreItem xmlns:ds="http://schemas.openxmlformats.org/officeDocument/2006/customXml" ds:itemID="{3374060B-0759-4390-9EE9-6A74F35BD728}">
+<ds:datastoreItem xmlns:ds="http://schemas.openxmlformats.org/officeDocument/2006/customXml" ds:itemID="{626459D5-1C0A-49E7-8E50-7FAF20AC32DD}">
   <ds:schemaRefs>
     <ds:schemaRef ds:uri="http://schemas.openxmlformats.org/officeDocument/2006/bibliography"/>
   </ds:schemaRefs>

</xml_diff>